<commit_message>
[claude] 引用查核：S-048 改為 verified，S-007 改引 PubMed 可讀的 S-063
ScienceDirect 一直卡在機器人驗證。S-048 以 ScienceDirect 摘要核對內容相符；
S-007 讀不到摘要，正文改引同團隊的東沙研究（Environ Pollut 2024，PMID 38885829）。
正文引用 58 筆全部已核對，不再有 🟡；來源總數 63。重新產出 Word／PDF（43 頁）。

Co-Authored-By: Claude Opus 5.5 <noreply@anthropic.com>
</commit_message>
<xml_diff>
--- a/proposal/AirSleuth_Proposal.docx
+++ b/proposal/AirSleuth_Proposal.docx
@@ -151,35 +151,7 @@
           <w:color w:val="555D6B"/>
           <w:sz w:val="22"/>
         </w:rPr>
-        <w:t>章參考文獻；標</w:t>
-      </w:r>
-      <w:r>
-        <w:rPr>
-          <w:color w:val="555D6B"/>
-          <w:sz w:val="22"/>
-        </w:rPr>
-        <w:t xml:space="preserve"> </w:t>
-      </w:r>
-      <w:r>
-        <w:rPr>
-          <w:color w:val="555D6B"/>
-          <w:sz w:val="22"/>
-        </w:rPr>
-        <w:t>🟡</w:t>
-      </w:r>
-      <w:r>
-        <w:rPr>
-          <w:color w:val="555D6B"/>
-          <w:sz w:val="22"/>
-        </w:rPr>
-        <w:t xml:space="preserve"> </w:t>
-      </w:r>
-      <w:r>
-        <w:rPr>
-          <w:color w:val="555D6B"/>
-          <w:sz w:val="22"/>
-        </w:rPr>
-        <w:t>者僅確認書目，數字需再核對原文。</w:t>
+        <w:t>章參考文獻，所有引用都已開啟原文或摘要核對。</w:t>
       </w:r>
     </w:p>
     <w:p>
@@ -217,7 +189,7 @@
       <w:r>
         <w:fldChar w:fldCharType="separate"/>
       </w:r>
-      <w:hyperlink w:anchor="_Toc244008684" w:history="1">
+      <w:hyperlink w:anchor="_Toc244012942" w:history="1">
         <w:r>
           <w:rPr>
             <w:rStyle w:val="affa"/>
@@ -260,7 +232,7 @@
             <w:noProof/>
             <w:webHidden/>
           </w:rPr>
-          <w:instrText xml:space="preserve"> PAGEREF _Toc244008684 \h </w:instrText>
+          <w:instrText xml:space="preserve"> PAGEREF _Toc244012942 \h </w:instrText>
         </w:r>
         <w:r>
           <w:rPr>
@@ -301,7 +273,7 @@
           <w:noProof/>
         </w:rPr>
       </w:pPr>
-      <w:hyperlink w:anchor="_Toc244008685" w:history="1">
+      <w:hyperlink w:anchor="_Toc244012943" w:history="1">
         <w:r>
           <w:rPr>
             <w:rStyle w:val="affa"/>
@@ -351,7 +323,7 @@
             <w:noProof/>
             <w:webHidden/>
           </w:rPr>
-          <w:instrText xml:space="preserve"> PAGEREF _Toc244008685 \h </w:instrText>
+          <w:instrText xml:space="preserve"> PAGEREF _Toc244012943 \h </w:instrText>
         </w:r>
         <w:r>
           <w:rPr>
@@ -392,7 +364,7 @@
           <w:noProof/>
         </w:rPr>
       </w:pPr>
-      <w:hyperlink w:anchor="_Toc244008686" w:history="1">
+      <w:hyperlink w:anchor="_Toc244012944" w:history="1">
         <w:r>
           <w:rPr>
             <w:rStyle w:val="affa"/>
@@ -427,7 +399,7 @@
             <w:noProof/>
             <w:webHidden/>
           </w:rPr>
-          <w:instrText xml:space="preserve"> PAGEREF _Toc244008686 \h </w:instrText>
+          <w:instrText xml:space="preserve"> PAGEREF _Toc244012944 \h </w:instrText>
         </w:r>
         <w:r>
           <w:rPr>
@@ -468,7 +440,7 @@
           <w:noProof/>
         </w:rPr>
       </w:pPr>
-      <w:hyperlink w:anchor="_Toc244008687" w:history="1">
+      <w:hyperlink w:anchor="_Toc244012945" w:history="1">
         <w:r>
           <w:rPr>
             <w:rStyle w:val="affa"/>
@@ -503,7 +475,7 @@
             <w:noProof/>
             <w:webHidden/>
           </w:rPr>
-          <w:instrText xml:space="preserve"> PAGEREF _Toc244008687 \h </w:instrText>
+          <w:instrText xml:space="preserve"> PAGEREF _Toc244012945 \h </w:instrText>
         </w:r>
         <w:r>
           <w:rPr>
@@ -544,7 +516,7 @@
           <w:noProof/>
         </w:rPr>
       </w:pPr>
-      <w:hyperlink w:anchor="_Toc244008688" w:history="1">
+      <w:hyperlink w:anchor="_Toc244012946" w:history="1">
         <w:r>
           <w:rPr>
             <w:rStyle w:val="affa"/>
@@ -579,7 +551,7 @@
             <w:noProof/>
             <w:webHidden/>
           </w:rPr>
-          <w:instrText xml:space="preserve"> PAGEREF _Toc244008688 \h </w:instrText>
+          <w:instrText xml:space="preserve"> PAGEREF _Toc244012946 \h </w:instrText>
         </w:r>
         <w:r>
           <w:rPr>
@@ -620,7 +592,7 @@
           <w:noProof/>
         </w:rPr>
       </w:pPr>
-      <w:hyperlink w:anchor="_Toc244008689" w:history="1">
+      <w:hyperlink w:anchor="_Toc244012947" w:history="1">
         <w:r>
           <w:rPr>
             <w:rStyle w:val="affa"/>
@@ -655,7 +627,7 @@
             <w:noProof/>
             <w:webHidden/>
           </w:rPr>
-          <w:instrText xml:space="preserve"> PAGEREF _Toc244008689 \h </w:instrText>
+          <w:instrText xml:space="preserve"> PAGEREF _Toc244012947 \h </w:instrText>
         </w:r>
         <w:r>
           <w:rPr>
@@ -696,7 +668,7 @@
           <w:noProof/>
         </w:rPr>
       </w:pPr>
-      <w:hyperlink w:anchor="_Toc244008690" w:history="1">
+      <w:hyperlink w:anchor="_Toc244012948" w:history="1">
         <w:r>
           <w:rPr>
             <w:rStyle w:val="affa"/>
@@ -746,7 +718,7 @@
             <w:noProof/>
             <w:webHidden/>
           </w:rPr>
-          <w:instrText xml:space="preserve"> PAGEREF _Toc244008690 \h </w:instrText>
+          <w:instrText xml:space="preserve"> PAGEREF _Toc244012948 \h </w:instrText>
         </w:r>
         <w:r>
           <w:rPr>
@@ -787,7 +759,7 @@
           <w:noProof/>
         </w:rPr>
       </w:pPr>
-      <w:hyperlink w:anchor="_Toc244008691" w:history="1">
+      <w:hyperlink w:anchor="_Toc244012949" w:history="1">
         <w:r>
           <w:rPr>
             <w:rStyle w:val="affa"/>
@@ -822,7 +794,7 @@
             <w:noProof/>
             <w:webHidden/>
           </w:rPr>
-          <w:instrText xml:space="preserve"> PAGEREF _Toc244008691 \h </w:instrText>
+          <w:instrText xml:space="preserve"> PAGEREF _Toc244012949 \h </w:instrText>
         </w:r>
         <w:r>
           <w:rPr>
@@ -863,7 +835,7 @@
           <w:noProof/>
         </w:rPr>
       </w:pPr>
-      <w:hyperlink w:anchor="_Toc244008692" w:history="1">
+      <w:hyperlink w:anchor="_Toc244012950" w:history="1">
         <w:r>
           <w:rPr>
             <w:rStyle w:val="affa"/>
@@ -913,7 +885,7 @@
             <w:noProof/>
             <w:webHidden/>
           </w:rPr>
-          <w:instrText xml:space="preserve"> PAGEREF _Toc244008692 \h </w:instrText>
+          <w:instrText xml:space="preserve"> PAGEREF _Toc244012950 \h </w:instrText>
         </w:r>
         <w:r>
           <w:rPr>
@@ -954,7 +926,7 @@
           <w:noProof/>
         </w:rPr>
       </w:pPr>
-      <w:hyperlink w:anchor="_Toc244008693" w:history="1">
+      <w:hyperlink w:anchor="_Toc244012951" w:history="1">
         <w:r>
           <w:rPr>
             <w:rStyle w:val="affa"/>
@@ -989,7 +961,7 @@
             <w:noProof/>
             <w:webHidden/>
           </w:rPr>
-          <w:instrText xml:space="preserve"> PAGEREF _Toc244008693 \h </w:instrText>
+          <w:instrText xml:space="preserve"> PAGEREF _Toc244012951 \h </w:instrText>
         </w:r>
         <w:r>
           <w:rPr>
@@ -1030,7 +1002,7 @@
           <w:noProof/>
         </w:rPr>
       </w:pPr>
-      <w:hyperlink w:anchor="_Toc244008694" w:history="1">
+      <w:hyperlink w:anchor="_Toc244012952" w:history="1">
         <w:r>
           <w:rPr>
             <w:rStyle w:val="affa"/>
@@ -1065,7 +1037,7 @@
             <w:noProof/>
             <w:webHidden/>
           </w:rPr>
-          <w:instrText xml:space="preserve"> PAGEREF _Toc244008694 \h </w:instrText>
+          <w:instrText xml:space="preserve"> PAGEREF _Toc244012952 \h </w:instrText>
         </w:r>
         <w:r>
           <w:rPr>
@@ -1106,7 +1078,7 @@
           <w:noProof/>
         </w:rPr>
       </w:pPr>
-      <w:hyperlink w:anchor="_Toc244008695" w:history="1">
+      <w:hyperlink w:anchor="_Toc244012953" w:history="1">
         <w:r>
           <w:rPr>
             <w:rStyle w:val="affa"/>
@@ -1133,7 +1105,7 @@
             <w:noProof/>
             <w:webHidden/>
           </w:rPr>
-          <w:instrText xml:space="preserve"> PAGEREF _Toc244008695 \h </w:instrText>
+          <w:instrText xml:space="preserve"> PAGEREF _Toc244012953 \h </w:instrText>
         </w:r>
         <w:r>
           <w:rPr>
@@ -1174,7 +1146,7 @@
           <w:noProof/>
         </w:rPr>
       </w:pPr>
-      <w:hyperlink w:anchor="_Toc244008696" w:history="1">
+      <w:hyperlink w:anchor="_Toc244012954" w:history="1">
         <w:r>
           <w:rPr>
             <w:rStyle w:val="affa"/>
@@ -1250,7 +1222,7 @@
             <w:noProof/>
             <w:webHidden/>
           </w:rPr>
-          <w:instrText xml:space="preserve"> PAGEREF _Toc244008696 \h </w:instrText>
+          <w:instrText xml:space="preserve"> PAGEREF _Toc244012954 \h </w:instrText>
         </w:r>
         <w:r>
           <w:rPr>
@@ -1291,7 +1263,7 @@
           <w:noProof/>
         </w:rPr>
       </w:pPr>
-      <w:hyperlink w:anchor="_Toc244008697" w:history="1">
+      <w:hyperlink w:anchor="_Toc244012955" w:history="1">
         <w:r>
           <w:rPr>
             <w:rStyle w:val="affa"/>
@@ -1341,7 +1313,7 @@
             <w:noProof/>
             <w:webHidden/>
           </w:rPr>
-          <w:instrText xml:space="preserve"> PAGEREF _Toc244008697 \h </w:instrText>
+          <w:instrText xml:space="preserve"> PAGEREF _Toc244012955 \h </w:instrText>
         </w:r>
         <w:r>
           <w:rPr>
@@ -1382,7 +1354,7 @@
           <w:noProof/>
         </w:rPr>
       </w:pPr>
-      <w:hyperlink w:anchor="_Toc244008698" w:history="1">
+      <w:hyperlink w:anchor="_Toc244012956" w:history="1">
         <w:r>
           <w:rPr>
             <w:rStyle w:val="affa"/>
@@ -1417,7 +1389,7 @@
             <w:noProof/>
             <w:webHidden/>
           </w:rPr>
-          <w:instrText xml:space="preserve"> PAGEREF _Toc244008698 \h </w:instrText>
+          <w:instrText xml:space="preserve"> PAGEREF _Toc244012956 \h </w:instrText>
         </w:r>
         <w:r>
           <w:rPr>
@@ -1458,7 +1430,7 @@
           <w:noProof/>
         </w:rPr>
       </w:pPr>
-      <w:hyperlink w:anchor="_Toc244008699" w:history="1">
+      <w:hyperlink w:anchor="_Toc244012957" w:history="1">
         <w:r>
           <w:rPr>
             <w:rStyle w:val="affa"/>
@@ -1493,7 +1465,7 @@
             <w:noProof/>
             <w:webHidden/>
           </w:rPr>
-          <w:instrText xml:space="preserve"> PAGEREF _Toc244008699 \h </w:instrText>
+          <w:instrText xml:space="preserve"> PAGEREF _Toc244012957 \h </w:instrText>
         </w:r>
         <w:r>
           <w:rPr>
@@ -1534,7 +1506,7 @@
           <w:noProof/>
         </w:rPr>
       </w:pPr>
-      <w:hyperlink w:anchor="_Toc244008700" w:history="1">
+      <w:hyperlink w:anchor="_Toc244012958" w:history="1">
         <w:r>
           <w:rPr>
             <w:rStyle w:val="affa"/>
@@ -1569,7 +1541,7 @@
             <w:noProof/>
             <w:webHidden/>
           </w:rPr>
-          <w:instrText xml:space="preserve"> PAGEREF _Toc244008700 \h </w:instrText>
+          <w:instrText xml:space="preserve"> PAGEREF _Toc244012958 \h </w:instrText>
         </w:r>
         <w:r>
           <w:rPr>
@@ -1610,7 +1582,7 @@
           <w:noProof/>
         </w:rPr>
       </w:pPr>
-      <w:hyperlink w:anchor="_Toc244008701" w:history="1">
+      <w:hyperlink w:anchor="_Toc244012959" w:history="1">
         <w:r>
           <w:rPr>
             <w:rStyle w:val="affa"/>
@@ -1660,7 +1632,7 @@
             <w:noProof/>
             <w:webHidden/>
           </w:rPr>
-          <w:instrText xml:space="preserve"> PAGEREF _Toc244008701 \h </w:instrText>
+          <w:instrText xml:space="preserve"> PAGEREF _Toc244012959 \h </w:instrText>
         </w:r>
         <w:r>
           <w:rPr>
@@ -1701,7 +1673,7 @@
           <w:noProof/>
         </w:rPr>
       </w:pPr>
-      <w:hyperlink w:anchor="_Toc244008702" w:history="1">
+      <w:hyperlink w:anchor="_Toc244012960" w:history="1">
         <w:r>
           <w:rPr>
             <w:rStyle w:val="affa"/>
@@ -1736,7 +1708,7 @@
             <w:noProof/>
             <w:webHidden/>
           </w:rPr>
-          <w:instrText xml:space="preserve"> PAGEREF _Toc244008702 \h </w:instrText>
+          <w:instrText xml:space="preserve"> PAGEREF _Toc244012960 \h </w:instrText>
         </w:r>
         <w:r>
           <w:rPr>
@@ -1777,7 +1749,7 @@
           <w:noProof/>
         </w:rPr>
       </w:pPr>
-      <w:hyperlink w:anchor="_Toc244008703" w:history="1">
+      <w:hyperlink w:anchor="_Toc244012961" w:history="1">
         <w:r>
           <w:rPr>
             <w:rStyle w:val="affa"/>
@@ -1804,7 +1776,7 @@
             <w:noProof/>
             <w:webHidden/>
           </w:rPr>
-          <w:instrText xml:space="preserve"> PAGEREF _Toc244008703 \h </w:instrText>
+          <w:instrText xml:space="preserve"> PAGEREF _Toc244012961 \h </w:instrText>
         </w:r>
         <w:r>
           <w:rPr>
@@ -1845,7 +1817,7 @@
           <w:noProof/>
         </w:rPr>
       </w:pPr>
-      <w:hyperlink w:anchor="_Toc244008704" w:history="1">
+      <w:hyperlink w:anchor="_Toc244012962" w:history="1">
         <w:r>
           <w:rPr>
             <w:rStyle w:val="affa"/>
@@ -1880,7 +1852,7 @@
             <w:noProof/>
             <w:webHidden/>
           </w:rPr>
-          <w:instrText xml:space="preserve"> PAGEREF _Toc244008704 \h </w:instrText>
+          <w:instrText xml:space="preserve"> PAGEREF _Toc244012962 \h </w:instrText>
         </w:r>
         <w:r>
           <w:rPr>
@@ -1921,7 +1893,7 @@
           <w:noProof/>
         </w:rPr>
       </w:pPr>
-      <w:hyperlink w:anchor="_Toc244008705" w:history="1">
+      <w:hyperlink w:anchor="_Toc244012963" w:history="1">
         <w:r>
           <w:rPr>
             <w:rStyle w:val="affa"/>
@@ -1948,7 +1920,7 @@
             <w:noProof/>
             <w:webHidden/>
           </w:rPr>
-          <w:instrText xml:space="preserve"> PAGEREF _Toc244008705 \h </w:instrText>
+          <w:instrText xml:space="preserve"> PAGEREF _Toc244012963 \h </w:instrText>
         </w:r>
         <w:r>
           <w:rPr>
@@ -1989,7 +1961,7 @@
           <w:noProof/>
         </w:rPr>
       </w:pPr>
-      <w:hyperlink w:anchor="_Toc244008706" w:history="1">
+      <w:hyperlink w:anchor="_Toc244012964" w:history="1">
         <w:r>
           <w:rPr>
             <w:rStyle w:val="affa"/>
@@ -2016,7 +1988,7 @@
             <w:noProof/>
             <w:webHidden/>
           </w:rPr>
-          <w:instrText xml:space="preserve"> PAGEREF _Toc244008706 \h </w:instrText>
+          <w:instrText xml:space="preserve"> PAGEREF _Toc244012964 \h </w:instrText>
         </w:r>
         <w:r>
           <w:rPr>
@@ -2057,7 +2029,7 @@
           <w:noProof/>
         </w:rPr>
       </w:pPr>
-      <w:hyperlink w:anchor="_Toc244008707" w:history="1">
+      <w:hyperlink w:anchor="_Toc244012965" w:history="1">
         <w:r>
           <w:rPr>
             <w:rStyle w:val="affa"/>
@@ -2084,7 +2056,7 @@
             <w:noProof/>
             <w:webHidden/>
           </w:rPr>
-          <w:instrText xml:space="preserve"> PAGEREF _Toc244008707 \h </w:instrText>
+          <w:instrText xml:space="preserve"> PAGEREF _Toc244012965 \h </w:instrText>
         </w:r>
         <w:r>
           <w:rPr>
@@ -2125,7 +2097,7 @@
           <w:noProof/>
         </w:rPr>
       </w:pPr>
-      <w:hyperlink w:anchor="_Toc244008708" w:history="1">
+      <w:hyperlink w:anchor="_Toc244012966" w:history="1">
         <w:r>
           <w:rPr>
             <w:rStyle w:val="affa"/>
@@ -2175,7 +2147,7 @@
             <w:noProof/>
             <w:webHidden/>
           </w:rPr>
-          <w:instrText xml:space="preserve"> PAGEREF _Toc244008708 \h </w:instrText>
+          <w:instrText xml:space="preserve"> PAGEREF _Toc244012966 \h </w:instrText>
         </w:r>
         <w:r>
           <w:rPr>
@@ -2216,7 +2188,7 @@
         <w:pStyle w:val="1"/>
         <w:pageBreakBefore/>
       </w:pPr>
-      <w:bookmarkStart w:id="0" w:name="_Toc244008684"/>
+      <w:bookmarkStart w:id="0" w:name="_Toc244012942"/>
       <w:r>
         <w:rPr>
           <w:rFonts w:ascii="Times New Roman" w:eastAsia="標楷體" w:hAnsi="Times New Roman"/>
@@ -2476,7 +2448,7 @@
         <w:t>、敏感族群建議，以及從</w:t>
       </w:r>
       <w:r>
-        <w:t xml:space="preserve"> 62 </w:t>
+        <w:t xml:space="preserve"> 63 </w:t>
       </w:r>
       <w:r>
         <w:t>筆經查核文獻歸納的專家核心觀念；</w:t>
@@ -2614,7 +2586,7 @@
         <w:pStyle w:val="1"/>
         <w:pageBreakBefore/>
       </w:pPr>
-      <w:bookmarkStart w:id="1" w:name="_Toc244008685"/>
+      <w:bookmarkStart w:id="1" w:name="_Toc244012943"/>
       <w:r>
         <w:rPr>
           <w:rFonts w:ascii="Times New Roman" w:eastAsia="標楷體" w:hAnsi="Times New Roman"/>
@@ -2650,7 +2622,7 @@
       <w:pPr>
         <w:pStyle w:val="21"/>
       </w:pPr>
-      <w:bookmarkStart w:id="2" w:name="_Toc244008686"/>
+      <w:bookmarkStart w:id="2" w:name="_Toc244012944"/>
       <w:r>
         <w:rPr>
           <w:rFonts w:ascii="Times New Roman" w:eastAsia="標楷體" w:hAnsi="Times New Roman"/>
@@ -2904,7 +2876,7 @@
       <w:pPr>
         <w:pStyle w:val="21"/>
       </w:pPr>
-      <w:bookmarkStart w:id="3" w:name="_Toc244008687"/>
+      <w:bookmarkStart w:id="3" w:name="_Toc244012945"/>
       <w:r>
         <w:rPr>
           <w:rFonts w:ascii="Times New Roman" w:eastAsia="標楷體" w:hAnsi="Times New Roman"/>
@@ -3380,7 +3352,7 @@
       <w:pPr>
         <w:pStyle w:val="21"/>
       </w:pPr>
-      <w:bookmarkStart w:id="4" w:name="_Toc244008688"/>
+      <w:bookmarkStart w:id="4" w:name="_Toc244012946"/>
       <w:r>
         <w:rPr>
           <w:rFonts w:ascii="Times New Roman" w:eastAsia="標楷體" w:hAnsi="Times New Roman"/>
@@ -4147,7 +4119,7 @@
       <w:pPr>
         <w:pStyle w:val="21"/>
       </w:pPr>
-      <w:bookmarkStart w:id="5" w:name="_Toc244008689"/>
+      <w:bookmarkStart w:id="5" w:name="_Toc244012947"/>
       <w:r>
         <w:rPr>
           <w:rFonts w:ascii="Times New Roman" w:eastAsia="標楷體" w:hAnsi="Times New Roman"/>
@@ -4352,7 +4324,7 @@
       <w:pPr>
         <w:pStyle w:val="21"/>
       </w:pPr>
-      <w:bookmarkStart w:id="6" w:name="_Toc244008690"/>
+      <w:bookmarkStart w:id="6" w:name="_Toc244012948"/>
       <w:r>
         <w:rPr>
           <w:rFonts w:ascii="Times New Roman" w:eastAsia="標楷體" w:hAnsi="Times New Roman"/>
@@ -4807,7 +4779,7 @@
       <w:pPr>
         <w:pStyle w:val="21"/>
       </w:pPr>
-      <w:bookmarkStart w:id="7" w:name="_Toc244008691"/>
+      <w:bookmarkStart w:id="7" w:name="_Toc244012949"/>
       <w:r>
         <w:rPr>
           <w:rFonts w:ascii="Times New Roman" w:eastAsia="標楷體" w:hAnsi="Times New Roman"/>
@@ -4994,7 +4966,7 @@
         <w:t>：</w:t>
       </w:r>
       <w:r>
-        <w:t xml:space="preserve">62 </w:t>
+        <w:t xml:space="preserve">63 </w:t>
       </w:r>
       <w:r>
         <w:t>筆經查核的文獻、</w:t>
@@ -5017,7 +4989,7 @@
         <w:pStyle w:val="1"/>
         <w:pageBreakBefore/>
       </w:pPr>
-      <w:bookmarkStart w:id="8" w:name="_Toc244008692"/>
+      <w:bookmarkStart w:id="8" w:name="_Toc244012950"/>
       <w:r>
         <w:rPr>
           <w:rFonts w:ascii="Times New Roman" w:eastAsia="標楷體" w:hAnsi="Times New Roman"/>
@@ -5115,7 +5087,7 @@
       <w:pPr>
         <w:pStyle w:val="21"/>
       </w:pPr>
-      <w:bookmarkStart w:id="9" w:name="_Toc244008693"/>
+      <w:bookmarkStart w:id="9" w:name="_Toc244012951"/>
       <w:r>
         <w:rPr>
           <w:rFonts w:ascii="Times New Roman" w:eastAsia="標楷體" w:hAnsi="Times New Roman"/>
@@ -6017,13 +5989,7 @@
         <w:t>等人</w:t>
       </w:r>
       <w:r>
-        <w:t xml:space="preserve"> [S-048 </w:t>
-      </w:r>
-      <w:r>
-        <w:t>🟡</w:t>
-      </w:r>
-      <w:r>
-        <w:t xml:space="preserve">] </w:t>
+        <w:t xml:space="preserve"> [S-048] </w:t>
       </w:r>
       <w:r>
         <w:t>以測站為節點，結合</w:t>
@@ -6163,7 +6129,7 @@
       <w:pPr>
         <w:pStyle w:val="21"/>
       </w:pPr>
-      <w:bookmarkStart w:id="10" w:name="_Toc244008694"/>
+      <w:bookmarkStart w:id="10" w:name="_Toc244012952"/>
       <w:r>
         <w:rPr>
           <w:rFonts w:ascii="Times New Roman" w:eastAsia="標楷體" w:hAnsi="Times New Roman"/>
@@ -6904,7 +6870,7 @@
       <w:pPr>
         <w:pStyle w:val="21"/>
       </w:pPr>
-      <w:bookmarkStart w:id="11" w:name="_Toc244008695"/>
+      <w:bookmarkStart w:id="11" w:name="_Toc244012953"/>
       <w:r>
         <w:rPr>
           <w:rFonts w:ascii="Times New Roman" w:eastAsia="標楷體" w:hAnsi="Times New Roman"/>
@@ -11904,7 +11870,7 @@
         <w:t>篇。完整的</w:t>
       </w:r>
       <w:r>
-        <w:t xml:space="preserve"> 62 </w:t>
+        <w:t xml:space="preserve"> 63 </w:t>
       </w:r>
       <w:r>
         <w:t>筆來源見</w:t>
@@ -11927,7 +11893,7 @@
       <w:pPr>
         <w:pStyle w:val="21"/>
       </w:pPr>
-      <w:bookmarkStart w:id="12" w:name="_Toc244008696"/>
+      <w:bookmarkStart w:id="12" w:name="_Toc244012954"/>
       <w:r>
         <w:rPr>
           <w:rFonts w:ascii="Times New Roman" w:eastAsia="標楷體" w:hAnsi="Times New Roman"/>
@@ -13958,7 +13924,7 @@
         <w:pStyle w:val="1"/>
         <w:pageBreakBefore/>
       </w:pPr>
-      <w:bookmarkStart w:id="13" w:name="_Toc244008697"/>
+      <w:bookmarkStart w:id="13" w:name="_Toc244012955"/>
       <w:r>
         <w:rPr>
           <w:rFonts w:ascii="Times New Roman" w:eastAsia="標楷體" w:hAnsi="Times New Roman"/>
@@ -13994,7 +13960,7 @@
       <w:pPr>
         <w:pStyle w:val="21"/>
       </w:pPr>
-      <w:bookmarkStart w:id="14" w:name="_Toc244008698"/>
+      <w:bookmarkStart w:id="14" w:name="_Toc244012956"/>
       <w:r>
         <w:rPr>
           <w:rFonts w:ascii="Times New Roman" w:eastAsia="標楷體" w:hAnsi="Times New Roman"/>
@@ -15532,7 +15498,7 @@
         <w:pStyle w:val="21"/>
         <w:pageBreakBefore/>
       </w:pPr>
-      <w:bookmarkStart w:id="15" w:name="_Toc244008699"/>
+      <w:bookmarkStart w:id="15" w:name="_Toc244012957"/>
       <w:r>
         <w:rPr>
           <w:rFonts w:ascii="Times New Roman" w:eastAsia="標楷體" w:hAnsi="Times New Roman"/>
@@ -15614,9 +15580,9 @@
         <w:tblLook w:val="04A0" w:firstRow="1" w:lastRow="0" w:firstColumn="1" w:lastColumn="0" w:noHBand="0" w:noVBand="1"/>
       </w:tblPr>
       <w:tblGrid>
-        <w:gridCol w:w="818"/>
-        <w:gridCol w:w="4401"/>
-        <w:gridCol w:w="3852"/>
+        <w:gridCol w:w="813"/>
+        <w:gridCol w:w="4574"/>
+        <w:gridCol w:w="3684"/>
       </w:tblGrid>
       <w:tr>
         <w:trPr>
@@ -15624,7 +15590,7 @@
         </w:trPr>
         <w:tc>
           <w:tcPr>
-            <w:tcW w:w="818" w:type="dxa"/>
+            <w:tcW w:w="813" w:type="dxa"/>
             <w:shd w:val="clear" w:color="auto" w:fill="DDE3EC"/>
           </w:tcPr>
           <w:p>
@@ -15635,7 +15601,7 @@
         </w:tc>
         <w:tc>
           <w:tcPr>
-            <w:tcW w:w="4401" w:type="dxa"/>
+            <w:tcW w:w="4574" w:type="dxa"/>
             <w:shd w:val="clear" w:color="auto" w:fill="DDE3EC"/>
           </w:tcPr>
           <w:p>
@@ -15667,7 +15633,7 @@
         </w:tc>
         <w:tc>
           <w:tcPr>
-            <w:tcW w:w="3852" w:type="dxa"/>
+            <w:tcW w:w="3684" w:type="dxa"/>
             <w:shd w:val="clear" w:color="auto" w:fill="DDE3EC"/>
           </w:tcPr>
           <w:p>
@@ -15704,7 +15670,7 @@
         </w:trPr>
         <w:tc>
           <w:tcPr>
-            <w:tcW w:w="818" w:type="dxa"/>
+            <w:tcW w:w="813" w:type="dxa"/>
           </w:tcPr>
           <w:p>
             <w:pPr>
@@ -15721,7 +15687,7 @@
         </w:tc>
         <w:tc>
           <w:tcPr>
-            <w:tcW w:w="4401" w:type="dxa"/>
+            <w:tcW w:w="4574" w:type="dxa"/>
           </w:tcPr>
           <w:p>
             <w:pPr>
@@ -15737,7 +15703,7 @@
         </w:tc>
         <w:tc>
           <w:tcPr>
-            <w:tcW w:w="3852" w:type="dxa"/>
+            <w:tcW w:w="3684" w:type="dxa"/>
           </w:tcPr>
           <w:p>
             <w:pPr>
@@ -15758,7 +15724,7 @@
         </w:trPr>
         <w:tc>
           <w:tcPr>
-            <w:tcW w:w="818" w:type="dxa"/>
+            <w:tcW w:w="813" w:type="dxa"/>
           </w:tcPr>
           <w:p>
             <w:pPr>
@@ -15775,7 +15741,7 @@
         </w:tc>
         <w:tc>
           <w:tcPr>
-            <w:tcW w:w="4401" w:type="dxa"/>
+            <w:tcW w:w="4574" w:type="dxa"/>
           </w:tcPr>
           <w:p>
             <w:pPr>
@@ -15881,31 +15847,43 @@
               <w:rPr>
                 <w:sz w:val="20"/>
               </w:rPr>
-              <w:t>；外島的跨境比例更高</w:t>
-            </w:r>
-            <w:r>
-              <w:rPr>
-                <w:sz w:val="20"/>
-              </w:rPr>
-              <w:t xml:space="preserve"> [S-007 </w:t>
-            </w:r>
-            <w:r>
-              <w:rPr>
-                <w:sz w:val="20"/>
-              </w:rPr>
-              <w:t>🟡</w:t>
-            </w:r>
-            <w:r>
-              <w:rPr>
-                <w:sz w:val="20"/>
-              </w:rPr>
-              <w:t>]</w:t>
-            </w:r>
-          </w:p>
-        </w:tc>
-        <w:tc>
-          <w:tcPr>
-            <w:tcW w:w="3852" w:type="dxa"/>
+              <w:t>；南海東沙島長程傳輸自秋季起佔</w:t>
+            </w:r>
+            <w:r>
+              <w:rPr>
+                <w:sz w:val="20"/>
+              </w:rPr>
+              <w:t xml:space="preserve"> 52.1%</w:t>
+            </w:r>
+            <w:r>
+              <w:rPr>
+                <w:sz w:val="20"/>
+              </w:rPr>
+              <w:t>～</w:t>
+            </w:r>
+            <w:r>
+              <w:rPr>
+                <w:sz w:val="20"/>
+              </w:rPr>
+              <w:t>74.3%</w:t>
+            </w:r>
+            <w:r>
+              <w:rPr>
+                <w:sz w:val="20"/>
+              </w:rPr>
+              <w:t>（夏季除外）</w:t>
+            </w:r>
+            <w:r>
+              <w:rPr>
+                <w:sz w:val="20"/>
+              </w:rPr>
+              <w:t>[S-063]</w:t>
+            </w:r>
+          </w:p>
+        </w:tc>
+        <w:tc>
+          <w:tcPr>
+            <w:tcW w:w="3684" w:type="dxa"/>
           </w:tcPr>
           <w:p>
             <w:pPr>
@@ -17407,7 +17385,7 @@
         <w:pStyle w:val="21"/>
         <w:pageBreakBefore/>
       </w:pPr>
-      <w:bookmarkStart w:id="16" w:name="_Toc244008700"/>
+      <w:bookmarkStart w:id="16" w:name="_Toc244012958"/>
       <w:r>
         <w:rPr>
           <w:rFonts w:ascii="Times New Roman" w:eastAsia="標楷體" w:hAnsi="Times New Roman"/>
@@ -19039,7 +19017,7 @@
         <w:pStyle w:val="1"/>
         <w:pageBreakBefore/>
       </w:pPr>
-      <w:bookmarkStart w:id="17" w:name="_Toc244008701"/>
+      <w:bookmarkStart w:id="17" w:name="_Toc244012959"/>
       <w:r>
         <w:rPr>
           <w:rFonts w:ascii="Times New Roman" w:eastAsia="標楷體" w:hAnsi="Times New Roman"/>
@@ -19075,7 +19053,7 @@
       <w:pPr>
         <w:pStyle w:val="21"/>
       </w:pPr>
-      <w:bookmarkStart w:id="18" w:name="_Toc244008702"/>
+      <w:bookmarkStart w:id="18" w:name="_Toc244012960"/>
       <w:r>
         <w:rPr>
           <w:rFonts w:ascii="Times New Roman" w:eastAsia="標楷體" w:hAnsi="Times New Roman"/>
@@ -19807,7 +19785,7 @@
       <w:pPr>
         <w:pStyle w:val="21"/>
       </w:pPr>
-      <w:bookmarkStart w:id="19" w:name="_Toc244008703"/>
+      <w:bookmarkStart w:id="19" w:name="_Toc244012961"/>
       <w:r>
         <w:rPr>
           <w:rFonts w:ascii="Times New Roman" w:eastAsia="標楷體" w:hAnsi="Times New Roman"/>
@@ -19827,7 +19805,7 @@
           <w:noProof/>
         </w:rPr>
         <w:drawing>
-          <wp:inline distT="0" distB="0" distL="0" distR="0" wp14:anchorId="0C399011" wp14:editId="1758A4EF">
+          <wp:inline distT="0" distB="0" distL="0" distR="0" wp14:anchorId="61344C62" wp14:editId="2E633C85">
             <wp:extent cx="4680000" cy="4835204"/>
             <wp:effectExtent l="0" t="0" r="0" b="0"/>
             <wp:docPr id="1" name="Picture 1"/>
@@ -20051,7 +20029,7 @@
       <w:pPr>
         <w:pStyle w:val="21"/>
       </w:pPr>
-      <w:bookmarkStart w:id="20" w:name="_Toc244008704"/>
+      <w:bookmarkStart w:id="20" w:name="_Toc244012962"/>
       <w:r>
         <w:rPr>
           <w:rFonts w:ascii="Times New Roman" w:eastAsia="標楷體" w:hAnsi="Times New Roman"/>
@@ -23419,7 +23397,7 @@
               <w:rPr>
                 <w:sz w:val="20"/>
               </w:rPr>
-              <w:t xml:space="preserve"> 62 </w:t>
+              <w:t xml:space="preserve"> 63 </w:t>
             </w:r>
             <w:r>
               <w:rPr>
@@ -24306,7 +24284,7 @@
       <w:pPr>
         <w:pStyle w:val="21"/>
       </w:pPr>
-      <w:bookmarkStart w:id="21" w:name="_Toc244008705"/>
+      <w:bookmarkStart w:id="21" w:name="_Toc244012963"/>
       <w:r>
         <w:rPr>
           <w:rFonts w:ascii="Times New Roman" w:eastAsia="標楷體" w:hAnsi="Times New Roman"/>
@@ -24326,7 +24304,7 @@
           <w:noProof/>
         </w:rPr>
         <w:drawing>
-          <wp:inline distT="0" distB="0" distL="0" distR="0" wp14:anchorId="3EBC269D" wp14:editId="53221AF1">
+          <wp:inline distT="0" distB="0" distL="0" distR="0" wp14:anchorId="301589E4" wp14:editId="4557C5EC">
             <wp:extent cx="5400000" cy="5647959"/>
             <wp:effectExtent l="0" t="0" r="0" b="0"/>
             <wp:docPr id="2" name="Picture 2"/>
@@ -24372,7 +24350,7 @@
         </w:rPr>
         <w:lastRenderedPageBreak/>
         <w:drawing>
-          <wp:inline distT="0" distB="0" distL="0" distR="0" wp14:anchorId="5E707B72" wp14:editId="1C3CB3D6">
+          <wp:inline distT="0" distB="0" distL="0" distR="0" wp14:anchorId="5350BD42" wp14:editId="5B79749A">
             <wp:extent cx="5400000" cy="7128827"/>
             <wp:effectExtent l="0" t="0" r="0" b="0"/>
             <wp:docPr id="3" name="Picture 3"/>
@@ -24727,7 +24705,7 @@
       <w:pPr>
         <w:pStyle w:val="21"/>
       </w:pPr>
-      <w:bookmarkStart w:id="22" w:name="_Toc244008706"/>
+      <w:bookmarkStart w:id="22" w:name="_Toc244012964"/>
       <w:r>
         <w:rPr>
           <w:rFonts w:ascii="Times New Roman" w:eastAsia="標楷體" w:hAnsi="Times New Roman"/>
@@ -25819,7 +25797,7 @@
       <w:pPr>
         <w:pStyle w:val="21"/>
       </w:pPr>
-      <w:bookmarkStart w:id="23" w:name="_Toc244008707"/>
+      <w:bookmarkStart w:id="23" w:name="_Toc244012965"/>
       <w:r>
         <w:rPr>
           <w:rFonts w:ascii="Times New Roman" w:eastAsia="標楷體" w:hAnsi="Times New Roman"/>
@@ -27952,7 +27930,7 @@
           <w:noProof/>
         </w:rPr>
         <w:drawing>
-          <wp:inline distT="0" distB="0" distL="0" distR="0" wp14:anchorId="5FCBD00A" wp14:editId="28F8EB6C">
+          <wp:inline distT="0" distB="0" distL="0" distR="0" wp14:anchorId="5D7B19CD" wp14:editId="5699AFDA">
             <wp:extent cx="5760000" cy="1548000"/>
             <wp:effectExtent l="0" t="0" r="0" b="0"/>
             <wp:docPr id="4" name="Picture 4"/>
@@ -28039,7 +28017,7 @@
         </w:rPr>
         <w:lastRenderedPageBreak/>
         <w:drawing>
-          <wp:inline distT="0" distB="0" distL="0" distR="0" wp14:anchorId="706C5544" wp14:editId="070FF30A">
+          <wp:inline distT="0" distB="0" distL="0" distR="0" wp14:anchorId="60FC2AFD" wp14:editId="450A2239">
             <wp:extent cx="5760000" cy="3584000"/>
             <wp:effectExtent l="0" t="0" r="0" b="0"/>
             <wp:docPr id="5" name="Picture 5"/>
@@ -28196,7 +28174,7 @@
         </w:rPr>
         <w:lastRenderedPageBreak/>
         <w:drawing>
-          <wp:inline distT="0" distB="0" distL="0" distR="0" wp14:anchorId="09EB7850" wp14:editId="297358F3">
+          <wp:inline distT="0" distB="0" distL="0" distR="0" wp14:anchorId="30CFB747" wp14:editId="2BB6FF14">
             <wp:extent cx="5040000" cy="4480000"/>
             <wp:effectExtent l="0" t="0" r="0" b="0"/>
             <wp:docPr id="6" name="Picture 6"/>
@@ -28317,7 +28295,7 @@
           <w:noProof/>
         </w:rPr>
         <w:drawing>
-          <wp:inline distT="0" distB="0" distL="0" distR="0" wp14:anchorId="49282B7B" wp14:editId="2518F948">
+          <wp:inline distT="0" distB="0" distL="0" distR="0" wp14:anchorId="26646567" wp14:editId="7492F0AA">
             <wp:extent cx="5760000" cy="3231875"/>
             <wp:effectExtent l="0" t="0" r="0" b="0"/>
             <wp:docPr id="7" name="Picture 7"/>
@@ -28432,7 +28410,7 @@
         </w:rPr>
         <w:lastRenderedPageBreak/>
         <w:drawing>
-          <wp:inline distT="0" distB="0" distL="0" distR="0" wp14:anchorId="4A2012B3" wp14:editId="4B7A4B2C">
+          <wp:inline distT="0" distB="0" distL="0" distR="0" wp14:anchorId="44279834" wp14:editId="3E06D2D7">
             <wp:extent cx="5760000" cy="2188800"/>
             <wp:effectExtent l="0" t="0" r="0" b="0"/>
             <wp:docPr id="8" name="Picture 8"/>
@@ -31091,7 +31069,7 @@
         <w:pStyle w:val="1"/>
         <w:pageBreakBefore/>
       </w:pPr>
-      <w:bookmarkStart w:id="24" w:name="_Toc244008708"/>
+      <w:bookmarkStart w:id="24" w:name="_Toc244012966"/>
       <w:r>
         <w:rPr>
           <w:rFonts w:ascii="Times New Roman" w:eastAsia="標楷體" w:hAnsi="Times New Roman"/>
@@ -31288,25 +31266,19 @@
         <w:rPr>
           <w:b/>
         </w:rPr>
-        <w:t>[S-007]</w:t>
-      </w:r>
-      <w:r>
-        <w:t xml:space="preserve"> </w:t>
-      </w:r>
-      <w:r>
-        <w:t>🟡</w:t>
-      </w:r>
-      <w:r>
-        <w:t xml:space="preserve"> Yuan et al. (2024). </w:t>
+        <w:t>[S-008]</w:t>
+      </w:r>
+      <w:r>
+        <w:t xml:space="preserve"> Barkjohn, Gantt &amp; Clements (2021). </w:t>
       </w:r>
       <w:r>
         <w:rPr>
           <w:i/>
         </w:rPr>
-        <w:t>Long-range transport and source apportionment of marine fine particles in the Taiwan Strait and South China Sea Intersection</w:t>
-      </w:r>
-      <w:r>
-        <w:t>. https://doi.org/10.1016/j.atmosenv.2024.120867</w:t>
+        <w:t>Development and application of a United States-wide correction for PM2.5 data collected with the PurpleAir sensor</w:t>
+      </w:r>
+      <w:r>
+        <w:t>. https://doi.org/10.5194/amt-14-4617-2021</w:t>
       </w:r>
     </w:p>
     <w:p>
@@ -31317,19 +31289,19 @@
         <w:rPr>
           <w:b/>
         </w:rPr>
-        <w:t>[S-008]</w:t>
-      </w:r>
-      <w:r>
-        <w:t xml:space="preserve"> Barkjohn, Gantt &amp; Clements (2021). </w:t>
+        <w:t>[S-009]</w:t>
+      </w:r>
+      <w:r>
+        <w:t xml:space="preserve"> Mathieu-Campbell et al. (2024). </w:t>
       </w:r>
       <w:r>
         <w:rPr>
           <w:i/>
         </w:rPr>
-        <w:t>Development and application of a United States-wide correction for PM2.5 data collected with the PurpleAir sensor</w:t>
-      </w:r>
-      <w:r>
-        <w:t>. https://doi.org/10.5194/amt-14-4617-2021</w:t>
+        <w:t>Calibration of PurpleAir low-cost particulate matter sensors: model development for air quality under high relative humidity conditions</w:t>
+      </w:r>
+      <w:r>
+        <w:t>. https://doi.org/10.5194/amt-17-6735-2024</w:t>
       </w:r>
     </w:p>
     <w:p>
@@ -31340,19 +31312,19 @@
         <w:rPr>
           <w:b/>
         </w:rPr>
-        <w:t>[S-009]</w:t>
-      </w:r>
-      <w:r>
-        <w:t xml:space="preserve"> Mathieu-Campbell et al. (2024). </w:t>
+        <w:t>[S-010]</w:t>
+      </w:r>
+      <w:r>
+        <w:t xml:space="preserve"> Nilson et al. (2022). </w:t>
       </w:r>
       <w:r>
         <w:rPr>
           <w:i/>
         </w:rPr>
-        <w:t>Calibration of PurpleAir low-cost particulate matter sensors: model development for air quality under high relative humidity conditions</w:t>
-      </w:r>
-      <w:r>
-        <w:t>. https://doi.org/10.5194/amt-17-6735-2024</w:t>
+        <w:t>Development and evaluation of correction models for a low-cost fine particulate matter monitor</w:t>
+      </w:r>
+      <w:r>
+        <w:t>. https://doi.org/10.5194/amt-15-3315-2022</w:t>
       </w:r>
     </w:p>
     <w:p>
@@ -31363,19 +31335,19 @@
         <w:rPr>
           <w:b/>
         </w:rPr>
-        <w:t>[S-010]</w:t>
-      </w:r>
-      <w:r>
-        <w:t xml:space="preserve"> Nilson et al. (2022). </w:t>
+        <w:t>[S-011]</w:t>
+      </w:r>
+      <w:r>
+        <w:t xml:space="preserve"> Lee, Wang &amp; Yu (2019). </w:t>
       </w:r>
       <w:r>
         <w:rPr>
           <w:i/>
         </w:rPr>
-        <w:t>Development and evaluation of correction models for a low-cost fine particulate matter monitor</w:t>
-      </w:r>
-      <w:r>
-        <w:t>. https://doi.org/10.5194/amt-15-3315-2022</w:t>
+        <w:t>An efficient spatiotemporal data calibration approach for the low-cost PM2.5 sensing network: A case study in Taiwan</w:t>
+      </w:r>
+      <w:r>
+        <w:t>. https://doi.org/10.1016/j.envint.2019.05.032</w:t>
       </w:r>
     </w:p>
     <w:p>
@@ -31386,19 +31358,19 @@
         <w:rPr>
           <w:b/>
         </w:rPr>
-        <w:t>[S-011]</w:t>
-      </w:r>
-      <w:r>
-        <w:t xml:space="preserve"> Lee, Wang &amp; Yu (2019). </w:t>
+        <w:t>[S-012]</w:t>
+      </w:r>
+      <w:r>
+        <w:t xml:space="preserve"> Chen et al. (2017). </w:t>
       </w:r>
       <w:r>
         <w:rPr>
           <w:i/>
         </w:rPr>
-        <w:t>An efficient spatiotemporal data calibration approach for the low-cost PM2.5 sensing network: A case study in Taiwan</w:t>
-      </w:r>
-      <w:r>
-        <w:t>. https://doi.org/10.1016/j.envint.2019.05.032</w:t>
+        <w:t>An Open Framework for Participatory PM2.5 Monitoring in Smart Cities</w:t>
+      </w:r>
+      <w:r>
+        <w:t>. https://doi.org/10.1109/ACCESS.2017.2723919</w:t>
       </w:r>
     </w:p>
     <w:p>
@@ -31409,19 +31381,19 @@
         <w:rPr>
           <w:b/>
         </w:rPr>
-        <w:t>[S-012]</w:t>
-      </w:r>
-      <w:r>
-        <w:t xml:space="preserve"> Chen et al. (2017). </w:t>
+        <w:t>[S-013]</w:t>
+      </w:r>
+      <w:r>
+        <w:t xml:space="preserve"> Chen &amp; Liu (2020). </w:t>
       </w:r>
       <w:r>
         <w:rPr>
           <w:i/>
         </w:rPr>
-        <w:t>An Open Framework for Participatory PM2.5 Monitoring in Smart Cities</w:t>
-      </w:r>
-      <w:r>
-        <w:t>. https://doi.org/10.1109/ACCESS.2017.2723919</w:t>
+        <w:t>Method for rapid deployment of low-cost sensors for a nationwide project in the Internet of things era: Air quality monitoring in Taiwan</w:t>
+      </w:r>
+      <w:r>
+        <w:t>. https://doi.org/10.1177/1550147720951334</w:t>
       </w:r>
     </w:p>
     <w:p>
@@ -31432,19 +31404,19 @@
         <w:rPr>
           <w:b/>
         </w:rPr>
-        <w:t>[S-013]</w:t>
-      </w:r>
-      <w:r>
-        <w:t xml:space="preserve"> Chen &amp; Liu (2020). </w:t>
+        <w:t>[S-014]</w:t>
+      </w:r>
+      <w:r>
+        <w:t xml:space="preserve"> Lung et al. (2025). </w:t>
       </w:r>
       <w:r>
         <w:rPr>
           <w:i/>
         </w:rPr>
-        <w:t>Method for rapid deployment of low-cost sensors for a nationwide project in the Internet of things era: Air quality monitoring in Taiwan</w:t>
-      </w:r>
-      <w:r>
-        <w:t>. https://doi.org/10.1177/1550147720951334</w:t>
+        <w:t>PM1 Source Evaluation with 3.5 Years of Monitoring in Central Taiwan Using Research-grade Low-cost Sensors</w:t>
+      </w:r>
+      <w:r>
+        <w:t>. https://doi.org/10.1007/s44408-025-00058-2</w:t>
       </w:r>
     </w:p>
     <w:p>
@@ -31455,19 +31427,49 @@
         <w:rPr>
           <w:b/>
         </w:rPr>
-        <w:t>[S-014]</w:t>
-      </w:r>
-      <w:r>
-        <w:t xml:space="preserve"> Lung et al. (2025). </w:t>
+        <w:t>[S-016]</w:t>
+      </w:r>
+      <w:r>
+        <w:t xml:space="preserve"> </w:t>
+      </w:r>
+      <w:r>
+        <w:t>環境部</w:t>
+      </w:r>
+      <w:r>
+        <w:t xml:space="preserve"> (2024). </w:t>
       </w:r>
       <w:r>
         <w:rPr>
           <w:i/>
         </w:rPr>
-        <w:t>PM1 Source Evaluation with 3.5 Years of Monitoring in Central Taiwan Using Research-grade Low-cost Sensors</w:t>
-      </w:r>
-      <w:r>
-        <w:t>. https://doi.org/10.1007/s44408-025-00058-2</w:t>
+        <w:t>接軌國際</w:t>
+      </w:r>
+      <w:r>
+        <w:rPr>
+          <w:i/>
+        </w:rPr>
+        <w:t xml:space="preserve"> </w:t>
+      </w:r>
+      <w:r>
+        <w:rPr>
+          <w:i/>
+        </w:rPr>
+        <w:t>環境部修正發布「空氣品質標準」並調整空氣品質指標</w:t>
+      </w:r>
+      <w:r>
+        <w:rPr>
+          <w:i/>
+        </w:rPr>
+        <w:t xml:space="preserve"> </w:t>
+      </w:r>
+      <w:r>
+        <w:rPr>
+          <w:i/>
+        </w:rPr>
+        <w:t>達亞洲最嚴</w:t>
+      </w:r>
+      <w:r>
+        <w:t>. https://air.moenv.gov.tw/News/news.aspx?type=news&amp;ID=6073</w:t>
       </w:r>
     </w:p>
     <w:p>
@@ -31478,13 +31480,13 @@
         <w:rPr>
           <w:b/>
         </w:rPr>
-        <w:t>[S-016]</w:t>
+        <w:t>[S-017]</w:t>
       </w:r>
       <w:r>
         <w:t xml:space="preserve"> </w:t>
       </w:r>
       <w:r>
-        <w:t>環境部</w:t>
+        <w:t>環境資訊中心</w:t>
       </w:r>
       <w:r>
         <w:t xml:space="preserve"> (2024). </w:t>
@@ -31493,34 +31495,22 @@
         <w:rPr>
           <w:i/>
         </w:rPr>
-        <w:t>接軌國際</w:t>
+        <w:t>明年起</w:t>
       </w:r>
       <w:r>
         <w:rPr>
           <w:i/>
         </w:rPr>
-        <w:t xml:space="preserve"> </w:t>
+        <w:t xml:space="preserve"> AQI </w:t>
       </w:r>
       <w:r>
         <w:rPr>
           <w:i/>
         </w:rPr>
-        <w:t>環境部修正發布「空氣品質標準」並調整空氣品質指標</w:t>
-      </w:r>
-      <w:r>
-        <w:rPr>
-          <w:i/>
-        </w:rPr>
-        <w:t xml:space="preserve"> </w:t>
-      </w:r>
-      <w:r>
-        <w:rPr>
-          <w:i/>
-        </w:rPr>
-        <w:t>達亞洲最嚴</w:t>
-      </w:r>
-      <w:r>
-        <w:t>. https://air.moenv.gov.tw/News/news.aspx?type=news&amp;ID=6073</w:t>
+        <w:t>黃、橘燈會增加？環境部修正空氣品質標準重點一次看</w:t>
+      </w:r>
+      <w:r>
+        <w:t>. https://e-info.org.tw/node/240005</w:t>
       </w:r>
     </w:p>
     <w:p>
@@ -31532,13 +31522,13 @@
           <w:b/>
         </w:rPr>
         <w:lastRenderedPageBreak/>
-        <w:t>[S-017]</w:t>
+        <w:t>[S-018]</w:t>
       </w:r>
       <w:r>
         <w:t xml:space="preserve"> </w:t>
       </w:r>
       <w:r>
-        <w:t>環境資訊中心</w:t>
+        <w:t>衛生福利部</w:t>
       </w:r>
       <w:r>
         <w:t xml:space="preserve"> (2024). </w:t>
@@ -31547,22 +31537,10 @@
         <w:rPr>
           <w:i/>
         </w:rPr>
-        <w:t>明年起</w:t>
-      </w:r>
-      <w:r>
-        <w:rPr>
-          <w:i/>
-        </w:rPr>
-        <w:t xml:space="preserve"> AQI </w:t>
-      </w:r>
-      <w:r>
-        <w:rPr>
-          <w:i/>
-        </w:rPr>
-        <w:t>黃、橘燈會增加？環境部修正空氣品質標準重點一次看</w:t>
-      </w:r>
-      <w:r>
-        <w:t>. https://e-info.org.tw/node/240005</w:t>
+        <w:t>國衛院實證研究推動改善臺灣空氣品質標準與指標</w:t>
+      </w:r>
+      <w:r>
+        <w:t>. https://www.mohw.gov.tw/cp-16-78708-1.html</w:t>
       </w:r>
     </w:p>
     <w:p>
@@ -31573,25 +31551,19 @@
         <w:rPr>
           <w:b/>
         </w:rPr>
-        <w:t>[S-018]</w:t>
-      </w:r>
-      <w:r>
-        <w:t xml:space="preserve"> </w:t>
-      </w:r>
-      <w:r>
-        <w:t>衛生福利部</w:t>
-      </w:r>
-      <w:r>
-        <w:t xml:space="preserve"> (2024). </w:t>
+        <w:t>[S-019]</w:t>
+      </w:r>
+      <w:r>
+        <w:t xml:space="preserve"> U.S. EPA (2024). </w:t>
       </w:r>
       <w:r>
         <w:rPr>
           <w:i/>
         </w:rPr>
-        <w:t>國衛院實證研究推動改善臺灣空氣品質標準與指標</w:t>
-      </w:r>
-      <w:r>
-        <w:t>. https://www.mohw.gov.tw/cp-16-78708-1.html</w:t>
+        <w:t>Final Reconsideration of the National Ambient Air Quality Standards for Particulate Matter</w:t>
+      </w:r>
+      <w:r>
+        <w:t>. https://www.epa.gov/pm-pollution/final-reconsideration-national-ambient-air-quality-standards-particulate-matter-pm</w:t>
       </w:r>
     </w:p>
     <w:p>
@@ -31602,19 +31574,19 @@
         <w:rPr>
           <w:b/>
         </w:rPr>
-        <w:t>[S-019]</w:t>
-      </w:r>
-      <w:r>
-        <w:t xml:space="preserve"> U.S. EPA (2024). </w:t>
+        <w:t>[S-020]</w:t>
+      </w:r>
+      <w:r>
+        <w:t xml:space="preserve"> WHO (2021). </w:t>
       </w:r>
       <w:r>
         <w:rPr>
           <w:i/>
         </w:rPr>
-        <w:t>Final Reconsideration of the National Ambient Air Quality Standards for Particulate Matter</w:t>
-      </w:r>
-      <w:r>
-        <w:t>. https://www.epa.gov/pm-pollution/final-reconsideration-national-ambient-air-quality-standards-particulate-matter-pm</w:t>
+        <w:t>WHO global air quality guidelines</w:t>
+      </w:r>
+      <w:r>
+        <w:t>. https://www.who.int/publications/i/item/9789240034228</w:t>
       </w:r>
     </w:p>
     <w:p>
@@ -31625,19 +31597,19 @@
         <w:rPr>
           <w:b/>
         </w:rPr>
-        <w:t>[S-020]</w:t>
-      </w:r>
-      <w:r>
-        <w:t xml:space="preserve"> WHO (2021). </w:t>
+        <w:t>[S-021]</w:t>
+      </w:r>
+      <w:r>
+        <w:t xml:space="preserve"> Di et al. (2017). </w:t>
       </w:r>
       <w:r>
         <w:rPr>
           <w:i/>
         </w:rPr>
-        <w:t>WHO global air quality guidelines</w:t>
-      </w:r>
-      <w:r>
-        <w:t>. https://www.who.int/publications/i/item/9789240034228</w:t>
+        <w:t>Air Pollution and Mortality in the Medicare Population</w:t>
+      </w:r>
+      <w:r>
+        <w:t>. https://doi.org/10.1056/NEJMoa1702747</w:t>
       </w:r>
     </w:p>
     <w:p>
@@ -31648,19 +31620,37 @@
         <w:rPr>
           <w:b/>
         </w:rPr>
-        <w:t>[S-021]</w:t>
-      </w:r>
-      <w:r>
-        <w:t xml:space="preserve"> Di et al. (2017). </w:t>
+        <w:t>[S-022]</w:t>
+      </w:r>
+      <w:r>
+        <w:t xml:space="preserve"> </w:t>
+      </w:r>
+      <w:r>
+        <w:t>經濟日報（引述環境部）</w:t>
+      </w:r>
+      <w:r>
+        <w:t xml:space="preserve"> (2026). </w:t>
       </w:r>
       <w:r>
         <w:rPr>
           <w:i/>
         </w:rPr>
-        <w:t>Air Pollution and Mortality in the Medicare Population</w:t>
-      </w:r>
-      <w:r>
-        <w:t>. https://doi.org/10.1056/NEJMoa1702747</w:t>
+        <w:t>環境部：國外報告空品排名定義遭誤解</w:t>
+      </w:r>
+      <w:r>
+        <w:rPr>
+          <w:i/>
+        </w:rPr>
+        <w:t xml:space="preserve"> </w:t>
+      </w:r>
+      <w:r>
+        <w:rPr>
+          <w:i/>
+        </w:rPr>
+        <w:t>台灣空氣品質全球排名進步中</w:t>
+      </w:r>
+      <w:r>
+        <w:t>. https://udn.com/news/story/7266/9402567</w:t>
       </w:r>
     </w:p>
     <w:p>
@@ -31671,37 +31661,49 @@
         <w:rPr>
           <w:b/>
         </w:rPr>
-        <w:t>[S-022]</w:t>
+        <w:t>[S-023]</w:t>
       </w:r>
       <w:r>
         <w:t xml:space="preserve"> </w:t>
       </w:r>
       <w:r>
-        <w:t>經濟日報（引述環境部）</w:t>
-      </w:r>
-      <w:r>
-        <w:t xml:space="preserve"> (2026). </w:t>
+        <w:t>公視新聞網</w:t>
+      </w:r>
+      <w:r>
+        <w:t xml:space="preserve"> (2024). </w:t>
       </w:r>
       <w:r>
         <w:rPr>
           <w:i/>
         </w:rPr>
-        <w:t>環境部：國外報告空品排名定義遭誤解</w:t>
+        <w:t>空品監測近</w:t>
       </w:r>
       <w:r>
         <w:rPr>
           <w:i/>
         </w:rPr>
-        <w:t xml:space="preserve"> </w:t>
+        <w:t>5</w:t>
       </w:r>
       <w:r>
         <w:rPr>
           <w:i/>
         </w:rPr>
-        <w:t>台灣空氣品質全球排名進步中</w:t>
-      </w:r>
-      <w:r>
-        <w:t>. https://udn.com/news/story/7266/9402567</w:t>
+        <w:t>年污染物濃度降</w:t>
+      </w:r>
+      <w:r>
+        <w:rPr>
+          <w:i/>
+        </w:rPr>
+        <w:t xml:space="preserve"> PM2.5</w:t>
+      </w:r>
+      <w:r>
+        <w:rPr>
+          <w:i/>
+        </w:rPr>
+        <w:t>年平均濃度比去年改善</w:t>
+      </w:r>
+      <w:r>
+        <w:t>. https://news.pts.org.tw/article/730797</w:t>
       </w:r>
     </w:p>
     <w:p>
@@ -31712,49 +31714,19 @@
         <w:rPr>
           <w:b/>
         </w:rPr>
-        <w:t>[S-023]</w:t>
-      </w:r>
-      <w:r>
-        <w:t xml:space="preserve"> </w:t>
-      </w:r>
-      <w:r>
-        <w:t>公視新聞網</w:t>
-      </w:r>
-      <w:r>
-        <w:t xml:space="preserve"> (2024). </w:t>
+        <w:t>[S-024]</w:t>
+      </w:r>
+      <w:r>
+        <w:t xml:space="preserve"> Tsai, Chen &amp; Yang (2025). </w:t>
       </w:r>
       <w:r>
         <w:rPr>
           <w:i/>
         </w:rPr>
-        <w:t>空品監測近</w:t>
-      </w:r>
-      <w:r>
-        <w:rPr>
-          <w:i/>
-        </w:rPr>
-        <w:t>5</w:t>
-      </w:r>
-      <w:r>
-        <w:rPr>
-          <w:i/>
-        </w:rPr>
-        <w:t>年污染物濃度降</w:t>
-      </w:r>
-      <w:r>
-        <w:rPr>
-          <w:i/>
-        </w:rPr>
-        <w:t xml:space="preserve"> PM2.5</w:t>
-      </w:r>
-      <w:r>
-        <w:rPr>
-          <w:i/>
-        </w:rPr>
-        <w:t>年平均濃度比去年改善</w:t>
-      </w:r>
-      <w:r>
-        <w:t>. https://news.pts.org.tw/article/730797</w:t>
+        <w:t>The effect of exposure to ambient air fine particulate matter pollution on mortality among children aged under five in Taiwan</w:t>
+      </w:r>
+      <w:r>
+        <w:t>. https://doi.org/10.1080/15287394.2025.2521644</w:t>
       </w:r>
     </w:p>
     <w:p>
@@ -31765,19 +31737,19 @@
         <w:rPr>
           <w:b/>
         </w:rPr>
-        <w:t>[S-024]</w:t>
-      </w:r>
-      <w:r>
-        <w:t xml:space="preserve"> Tsai, Chen &amp; Yang (2025). </w:t>
+        <w:t>[S-025]</w:t>
+      </w:r>
+      <w:r>
+        <w:t xml:space="preserve"> Tsao et al. (2025). </w:t>
       </w:r>
       <w:r>
         <w:rPr>
           <w:i/>
         </w:rPr>
-        <w:t>The effect of exposure to ambient air fine particulate matter pollution on mortality among children aged under five in Taiwan</w:t>
-      </w:r>
-      <w:r>
-        <w:t>. https://doi.org/10.1080/15287394.2025.2521644</w:t>
+        <w:t>Trends in PM2.5 and mortality risks in an industrial District of Taiwan: a 12-year analysis</w:t>
+      </w:r>
+      <w:r>
+        <w:t>. https://doi.org/10.1080/09603123.2025.2568695</w:t>
       </w:r>
     </w:p>
     <w:p>
@@ -31788,19 +31760,19 @@
         <w:rPr>
           <w:b/>
         </w:rPr>
-        <w:t>[S-025]</w:t>
-      </w:r>
-      <w:r>
-        <w:t xml:space="preserve"> Tsao et al. (2025). </w:t>
+        <w:t>[S-026]</w:t>
+      </w:r>
+      <w:r>
+        <w:t xml:space="preserve"> Tsai &amp; Yang (2024). </w:t>
       </w:r>
       <w:r>
         <w:rPr>
           <w:i/>
         </w:rPr>
-        <w:t>Trends in PM2.5 and mortality risks in an industrial District of Taiwan: a 12-year analysis</w:t>
-      </w:r>
-      <w:r>
-        <w:t>. https://doi.org/10.1080/09603123.2025.2568695</w:t>
+        <w:t>The impacts of reduction in ambient fine particulate air pollution on natural-cause mortality in Taiwan</w:t>
+      </w:r>
+      <w:r>
+        <w:t>. https://doi.org/10.1080/15287394.2024.2384396</w:t>
       </w:r>
     </w:p>
     <w:p>
@@ -31811,19 +31783,19 @@
         <w:rPr>
           <w:b/>
         </w:rPr>
-        <w:t>[S-026]</w:t>
-      </w:r>
-      <w:r>
-        <w:t xml:space="preserve"> Tsai &amp; Yang (2024). </w:t>
+        <w:t>[S-027]</w:t>
+      </w:r>
+      <w:r>
+        <w:t xml:space="preserve"> Orellano et al. (2020). </w:t>
       </w:r>
       <w:r>
         <w:rPr>
           <w:i/>
         </w:rPr>
-        <w:t>The impacts of reduction in ambient fine particulate air pollution on natural-cause mortality in Taiwan</w:t>
-      </w:r>
-      <w:r>
-        <w:t>. https://doi.org/10.1080/15287394.2024.2384396</w:t>
+        <w:t>Short-term exposure to particulate matter (PM10 and PM2.5), nitrogen dioxide (NO2), and ozone (O3) and all-cause and cause-specific mortality: Systematic review and meta-analysis</w:t>
+      </w:r>
+      <w:r>
+        <w:t>. https://doi.org/10.1016/j.envint.2020.105876</w:t>
       </w:r>
     </w:p>
     <w:p>
@@ -31834,19 +31806,19 @@
         <w:rPr>
           <w:b/>
         </w:rPr>
-        <w:t>[S-027]</w:t>
-      </w:r>
-      <w:r>
-        <w:t xml:space="preserve"> Orellano et al. (2020). </w:t>
+        <w:t>[S-028]</w:t>
+      </w:r>
+      <w:r>
+        <w:t xml:space="preserve"> D'Antoni et al. (2017). </w:t>
       </w:r>
       <w:r>
         <w:rPr>
           <w:i/>
         </w:rPr>
-        <w:t>Short-term exposure to particulate matter (PM10 and PM2.5), nitrogen dioxide (NO2), and ozone (O3) and all-cause and cause-specific mortality: Systematic review and meta-analysis</w:t>
-      </w:r>
-      <w:r>
-        <w:t>. https://doi.org/10.1016/j.envint.2020.105876</w:t>
+        <w:t>Psychosocial and demographic predictors of adherence and non-adherence to health advice accompanying air quality warning systems: a systematic review</w:t>
+      </w:r>
+      <w:r>
+        <w:t>. https://doi.org/10.1186/s12940-017-0307-4</w:t>
       </w:r>
     </w:p>
     <w:p>
@@ -31857,19 +31829,49 @@
         <w:rPr>
           <w:b/>
         </w:rPr>
-        <w:t>[S-028]</w:t>
-      </w:r>
-      <w:r>
-        <w:t xml:space="preserve"> D'Antoni et al. (2017). </w:t>
+        <w:t>[S-029]</w:t>
+      </w:r>
+      <w:r>
+        <w:t xml:space="preserve"> </w:t>
+      </w:r>
+      <w:r>
+        <w:t>臺中市政府環境保護局</w:t>
+      </w:r>
+      <w:r>
+        <w:t xml:space="preserve"> (2026). </w:t>
       </w:r>
       <w:r>
         <w:rPr>
           <w:i/>
         </w:rPr>
-        <w:t>Psychosocial and demographic predictors of adherence and non-adherence to health advice accompanying air quality warning systems: a systematic review</w:t>
-      </w:r>
-      <w:r>
-        <w:t>. https://doi.org/10.1186/s12940-017-0307-4</w:t>
+        <w:t>臺中市空氣品質指標分析（</w:t>
+      </w:r>
+      <w:r>
+        <w:rPr>
+          <w:i/>
+        </w:rPr>
+        <w:t xml:space="preserve">115 </w:t>
+      </w:r>
+      <w:r>
+        <w:rPr>
+          <w:i/>
+        </w:rPr>
+        <w:t>統計專題簡要分析）</w:t>
+      </w:r>
+      <w:r>
+        <w:t>. https://www.epb.taichung.gov.tw/media/1441872/115</w:t>
+      </w:r>
+      <w:r>
+        <w:t>統計專題簡要分析</w:t>
+      </w:r>
+      <w:r>
+        <w:t>__</w:t>
+      </w:r>
+      <w:r>
+        <w:t>臺中市空氣品質指標分析</w:t>
+      </w:r>
+      <w:r>
+        <w:t>.pdf</w:t>
       </w:r>
     </w:p>
     <w:p>
@@ -31880,49 +31882,19 @@
         <w:rPr>
           <w:b/>
         </w:rPr>
-        <w:t>[S-029]</w:t>
-      </w:r>
-      <w:r>
-        <w:t xml:space="preserve"> </w:t>
-      </w:r>
-      <w:r>
-        <w:t>臺中市政府環境保護局</w:t>
-      </w:r>
-      <w:r>
-        <w:t xml:space="preserve"> (2026). </w:t>
+        <w:t>[S-030]</w:t>
+      </w:r>
+      <w:r>
+        <w:t xml:space="preserve"> Mirabelli, Ebelt &amp; Damon (2020). </w:t>
       </w:r>
       <w:r>
         <w:rPr>
           <w:i/>
         </w:rPr>
-        <w:t>臺中市空氣品質指標分析（</w:t>
-      </w:r>
-      <w:r>
-        <w:rPr>
-          <w:i/>
-        </w:rPr>
-        <w:t xml:space="preserve">115 </w:t>
-      </w:r>
-      <w:r>
-        <w:rPr>
-          <w:i/>
-        </w:rPr>
-        <w:t>統計專題簡要分析）</w:t>
-      </w:r>
-      <w:r>
-        <w:t>. https://www.epb.taichung.gov.tw/media/1441872/115</w:t>
-      </w:r>
-      <w:r>
-        <w:t>統計專題簡要分析</w:t>
-      </w:r>
-      <w:r>
-        <w:t>__</w:t>
-      </w:r>
-      <w:r>
-        <w:t>臺中市空氣品質指標分析</w:t>
-      </w:r>
-      <w:r>
-        <w:t>.pdf</w:t>
+        <w:t>Air Quality Index and air quality awareness among adults in the United States</w:t>
+      </w:r>
+      <w:r>
+        <w:t>. https://doi.org/10.1016/j.envres.2020.109185</w:t>
       </w:r>
     </w:p>
     <w:p>
@@ -31933,19 +31905,19 @@
         <w:rPr>
           <w:b/>
         </w:rPr>
-        <w:t>[S-030]</w:t>
-      </w:r>
-      <w:r>
-        <w:t xml:space="preserve"> Mirabelli, Ebelt &amp; Damon (2020). </w:t>
+        <w:t>[S-031]</w:t>
+      </w:r>
+      <w:r>
+        <w:t xml:space="preserve"> Zheng et al. (2015). </w:t>
       </w:r>
       <w:r>
         <w:rPr>
           <w:i/>
         </w:rPr>
-        <w:t>Air Quality Index and air quality awareness among adults in the United States</w:t>
-      </w:r>
-      <w:r>
-        <w:t>. https://doi.org/10.1016/j.envres.2020.109185</w:t>
+        <w:t>Association between Air Pollutants and Asthma Emergency Room Visits and Hospital Admissions in Time Series Studies: A Systematic Review and Meta-Analysis</w:t>
+      </w:r>
+      <w:r>
+        <w:t>. https://doi.org/10.1371/journal.pone.0138146</w:t>
       </w:r>
     </w:p>
     <w:p>
@@ -31957,19 +31929,37 @@
           <w:b/>
         </w:rPr>
         <w:lastRenderedPageBreak/>
-        <w:t>[S-031]</w:t>
-      </w:r>
-      <w:r>
-        <w:t xml:space="preserve"> Zheng et al. (2015). </w:t>
+        <w:t>[S-032]</w:t>
+      </w:r>
+      <w:r>
+        <w:t xml:space="preserve"> </w:t>
+      </w:r>
+      <w:r>
+        <w:t>環境部</w:t>
+      </w:r>
+      <w:r>
+        <w:t xml:space="preserve"> (2018). </w:t>
       </w:r>
       <w:r>
         <w:rPr>
           <w:i/>
         </w:rPr>
-        <w:t>Association between Air Pollutants and Asthma Emergency Room Visits and Hospital Admissions in Time Series Studies: A Systematic Review and Meta-Analysis</w:t>
-      </w:r>
-      <w:r>
-        <w:t>. https://doi.org/10.1371/journal.pone.0138146</w:t>
+        <w:t>空氣品質指標（</w:t>
+      </w:r>
+      <w:r>
+        <w:rPr>
+          <w:i/>
+        </w:rPr>
+        <w:t xml:space="preserve">113 </w:t>
+      </w:r>
+      <w:r>
+        <w:rPr>
+          <w:i/>
+        </w:rPr>
+        <w:t>年前版本）</w:t>
+      </w:r>
+      <w:r>
+        <w:t>. https://airtw.moenv.gov.tw/CHT/Information/Standard/AirQualityIndicator.aspx</w:t>
       </w:r>
     </w:p>
     <w:p>
@@ -31980,37 +31970,19 @@
         <w:rPr>
           <w:b/>
         </w:rPr>
-        <w:t>[S-032]</w:t>
-      </w:r>
-      <w:r>
-        <w:t xml:space="preserve"> </w:t>
-      </w:r>
-      <w:r>
-        <w:t>環境部</w:t>
-      </w:r>
-      <w:r>
-        <w:t xml:space="preserve"> (2018). </w:t>
+        <w:t>[S-033]</w:t>
+      </w:r>
+      <w:r>
+        <w:t xml:space="preserve"> Tainio et al. (2016). </w:t>
       </w:r>
       <w:r>
         <w:rPr>
           <w:i/>
         </w:rPr>
-        <w:t>空氣品質指標（</w:t>
-      </w:r>
-      <w:r>
-        <w:rPr>
-          <w:i/>
-        </w:rPr>
-        <w:t xml:space="preserve">113 </w:t>
-      </w:r>
-      <w:r>
-        <w:rPr>
-          <w:i/>
-        </w:rPr>
-        <w:t>年前版本）</w:t>
-      </w:r>
-      <w:r>
-        <w:t>. https://airtw.moenv.gov.tw/CHT/Information/Standard/AirQualityIndicator.aspx</w:t>
+        <w:t>Can air pollution negate the health benefits of cycling and walking?</w:t>
+      </w:r>
+      <w:r>
+        <w:t>. https://doi.org/10.1016/j.ypmed.2016.02.002</w:t>
       </w:r>
     </w:p>
     <w:p>
@@ -32021,19 +31993,19 @@
         <w:rPr>
           <w:b/>
         </w:rPr>
-        <w:t>[S-033]</w:t>
-      </w:r>
-      <w:r>
-        <w:t xml:space="preserve"> Tainio et al. (2016). </w:t>
+        <w:t>[S-034]</w:t>
+      </w:r>
+      <w:r>
+        <w:t xml:space="preserve"> Klepeis et al. (2001). </w:t>
       </w:r>
       <w:r>
         <w:rPr>
           <w:i/>
         </w:rPr>
-        <w:t>Can air pollution negate the health benefits of cycling and walking?</w:t>
-      </w:r>
-      <w:r>
-        <w:t>. https://doi.org/10.1016/j.ypmed.2016.02.002</w:t>
+        <w:t>The National Human Activity Pattern Survey (NHAPS): a resource for assessing exposure to environmental pollutants</w:t>
+      </w:r>
+      <w:r>
+        <w:t>. https://doi.org/10.1038/sj.jea.7500165</w:t>
       </w:r>
     </w:p>
     <w:p>
@@ -32044,19 +32016,19 @@
         <w:rPr>
           <w:b/>
         </w:rPr>
-        <w:t>[S-034]</w:t>
-      </w:r>
-      <w:r>
-        <w:t xml:space="preserve"> Klepeis et al. (2001). </w:t>
+        <w:t>[S-035]</w:t>
+      </w:r>
+      <w:r>
+        <w:t xml:space="preserve"> Yao et al. (2022). </w:t>
       </w:r>
       <w:r>
         <w:rPr>
           <w:i/>
         </w:rPr>
-        <w:t>The National Human Activity Pattern Survey (NHAPS): a resource for assessing exposure to environmental pollutants</w:t>
-      </w:r>
-      <w:r>
-        <w:t>. https://doi.org/10.1038/sj.jea.7500165</w:t>
+        <w:t>ReAct: Synergizing Reasoning and Acting in Language Models</w:t>
+      </w:r>
+      <w:r>
+        <w:t>. https://arxiv.org/abs/2210.03629</w:t>
       </w:r>
     </w:p>
     <w:p>
@@ -32067,19 +32039,19 @@
         <w:rPr>
           <w:b/>
         </w:rPr>
-        <w:t>[S-035]</w:t>
-      </w:r>
-      <w:r>
-        <w:t xml:space="preserve"> Yao et al. (2022). </w:t>
+        <w:t>[S-036]</w:t>
+      </w:r>
+      <w:r>
+        <w:t xml:space="preserve"> Pan &amp; Nipu (2025). </w:t>
       </w:r>
       <w:r>
         <w:rPr>
           <w:i/>
         </w:rPr>
-        <w:t>ReAct: Synergizing Reasoning and Acting in Language Models</w:t>
-      </w:r>
-      <w:r>
-        <w:t>. https://arxiv.org/abs/2210.03629</w:t>
+        <w:t>LLM-enhanced Air Quality Monitoring Interface via Model Context Protocol</w:t>
+      </w:r>
+      <w:r>
+        <w:t>. https://arxiv.org/abs/2511.03706</w:t>
       </w:r>
     </w:p>
     <w:p>
@@ -32090,19 +32062,19 @@
         <w:rPr>
           <w:b/>
         </w:rPr>
-        <w:t>[S-036]</w:t>
-      </w:r>
-      <w:r>
-        <w:t xml:space="preserve"> Pan &amp; Nipu (2025). </w:t>
+        <w:t>[S-037]</w:t>
+      </w:r>
+      <w:r>
+        <w:t xml:space="preserve"> Acharya et al. (2025). </w:t>
       </w:r>
       <w:r>
         <w:rPr>
           <w:i/>
         </w:rPr>
-        <w:t>LLM-enhanced Air Quality Monitoring Interface via Model Context Protocol</w:t>
-      </w:r>
-      <w:r>
-        <w:t>. https://arxiv.org/abs/2511.03706</w:t>
+        <w:t>VayuChat: An LLM-Powered Conversational Interface for Air Quality Data Analytics</w:t>
+      </w:r>
+      <w:r>
+        <w:t>. https://arxiv.org/abs/2511.01046</w:t>
       </w:r>
     </w:p>
     <w:p>
@@ -32113,19 +32085,19 @@
         <w:rPr>
           <w:b/>
         </w:rPr>
-        <w:t>[S-037]</w:t>
-      </w:r>
-      <w:r>
-        <w:t xml:space="preserve"> Acharya et al. (2025). </w:t>
+        <w:t>[S-038]</w:t>
+      </w:r>
+      <w:r>
+        <w:t xml:space="preserve"> Vieira et al. (2026). </w:t>
       </w:r>
       <w:r>
         <w:rPr>
           <w:i/>
         </w:rPr>
-        <w:t>VayuChat: An LLM-Powered Conversational Interface for Air Quality Data Analytics</w:t>
-      </w:r>
-      <w:r>
-        <w:t>. https://arxiv.org/abs/2511.01046</w:t>
+        <w:t>Large Language Model based air quality monitoring and localized alert generation</w:t>
+      </w:r>
+      <w:r>
+        <w:t>. https://arxiv.org/abs/2609.17954</w:t>
       </w:r>
     </w:p>
     <w:p>
@@ -32136,19 +32108,19 @@
         <w:rPr>
           <w:b/>
         </w:rPr>
-        <w:t>[S-038]</w:t>
-      </w:r>
-      <w:r>
-        <w:t xml:space="preserve"> Vieira et al. (2026). </w:t>
+        <w:t>[S-039]</w:t>
+      </w:r>
+      <w:r>
+        <w:t xml:space="preserve"> Lee et al. (2025). </w:t>
       </w:r>
       <w:r>
         <w:rPr>
           <w:i/>
         </w:rPr>
-        <w:t>Large Language Model based air quality monitoring and localized alert generation</w:t>
-      </w:r>
-      <w:r>
-        <w:t>. https://arxiv.org/abs/2609.17954</w:t>
+        <w:t>LLM-based Question-Answer Framework for Sensor-driven HVAC System Interaction</w:t>
+      </w:r>
+      <w:r>
+        <w:t>. https://arxiv.org/abs/2507.04748</w:t>
       </w:r>
     </w:p>
     <w:p>
@@ -32159,19 +32131,19 @@
         <w:rPr>
           <w:b/>
         </w:rPr>
-        <w:t>[S-039]</w:t>
-      </w:r>
-      <w:r>
-        <w:t xml:space="preserve"> Lee et al. (2025). </w:t>
+        <w:t>[S-040]</w:t>
+      </w:r>
+      <w:r>
+        <w:t xml:space="preserve"> Li et al. (2025). </w:t>
       </w:r>
       <w:r>
         <w:rPr>
           <w:i/>
         </w:rPr>
-        <w:t>LLM-based Question-Answer Framework for Sensor-driven HVAC System Interaction</w:t>
-      </w:r>
-      <w:r>
-        <w:t>. https://arxiv.org/abs/2507.04748</w:t>
+        <w:t>Urban Computing in the Era of Large Language Models</w:t>
+      </w:r>
+      <w:r>
+        <w:t>. https://arxiv.org/abs/2504.02009</w:t>
       </w:r>
     </w:p>
     <w:p>
@@ -32182,19 +32154,19 @@
         <w:rPr>
           <w:b/>
         </w:rPr>
-        <w:t>[S-040]</w:t>
-      </w:r>
-      <w:r>
-        <w:t xml:space="preserve"> Li et al. (2025). </w:t>
+        <w:t>[S-041]</w:t>
+      </w:r>
+      <w:r>
+        <w:t xml:space="preserve"> Wang, Lung &amp; Liu (2020). </w:t>
       </w:r>
       <w:r>
         <w:rPr>
           <w:i/>
         </w:rPr>
-        <w:t>Urban Computing in the Era of Large Language Models</w:t>
-      </w:r>
-      <w:r>
-        <w:t>. https://arxiv.org/abs/2504.02009</w:t>
+        <w:t>Application of Machine Learning for the in-Field Correction of a PM2.5 Low-Cost Sensor Network</w:t>
+      </w:r>
+      <w:r>
+        <w:t>. https://doi.org/10.3390/s20175002</w:t>
       </w:r>
     </w:p>
     <w:p>
@@ -32205,19 +32177,19 @@
         <w:rPr>
           <w:b/>
         </w:rPr>
-        <w:t>[S-041]</w:t>
-      </w:r>
-      <w:r>
-        <w:t xml:space="preserve"> Wang, Lung &amp; Liu (2020). </w:t>
+        <w:t>[S-043]</w:t>
+      </w:r>
+      <w:r>
+        <w:t xml:space="preserve"> Wathore et al. (2026). </w:t>
       </w:r>
       <w:r>
         <w:rPr>
           <w:i/>
         </w:rPr>
-        <w:t>Application of Machine Learning for the in-Field Correction of a PM2.5 Low-Cost Sensor Network</w:t>
-      </w:r>
-      <w:r>
-        <w:t>. https://doi.org/10.3390/s20175002</w:t>
+        <w:t>Exploring Environmental and Temporal Performances of Machine Learning Models for Calibration of a Low-Cost PM2.5 Sensor</w:t>
+      </w:r>
+      <w:r>
+        <w:t>. https://doi.org/10.1007/s44408-026-00094-6</w:t>
       </w:r>
     </w:p>
     <w:p>
@@ -32228,19 +32200,19 @@
         <w:rPr>
           <w:b/>
         </w:rPr>
-        <w:t>[S-043]</w:t>
-      </w:r>
-      <w:r>
-        <w:t xml:space="preserve"> Wathore et al. (2026). </w:t>
+        <w:t>[S-044]</w:t>
+      </w:r>
+      <w:r>
+        <w:t xml:space="preserve"> Sengupta et al. (2026). </w:t>
       </w:r>
       <w:r>
         <w:rPr>
           <w:i/>
         </w:rPr>
-        <w:t>Exploring Environmental and Temporal Performances of Machine Learning Models for Calibration of a Low-Cost PM2.5 Sensor</w:t>
-      </w:r>
-      <w:r>
-        <w:t>. https://doi.org/10.1007/s44408-026-00094-6</w:t>
+        <w:t>A temporal deep learning framework for calibration of low-cost air quality sensors</w:t>
+      </w:r>
+      <w:r>
+        <w:t>. https://arxiv.org/abs/2604.21527</w:t>
       </w:r>
     </w:p>
     <w:p>
@@ -32251,19 +32223,19 @@
         <w:rPr>
           <w:b/>
         </w:rPr>
-        <w:t>[S-044]</w:t>
-      </w:r>
-      <w:r>
-        <w:t xml:space="preserve"> Sengupta et al. (2026). </w:t>
+        <w:t>[S-045]</w:t>
+      </w:r>
+      <w:r>
+        <w:t xml:space="preserve"> Jain, Presto &amp; Zimmerman (2021). </w:t>
       </w:r>
       <w:r>
         <w:rPr>
           <w:i/>
         </w:rPr>
-        <w:t>A temporal deep learning framework for calibration of low-cost air quality sensors</w:t>
-      </w:r>
-      <w:r>
-        <w:t>. https://arxiv.org/abs/2604.21527</w:t>
+        <w:t>Spatial Modeling of Daily PM2.5, NO2, and CO Concentrations Measured by a Low-Cost Sensor Network</w:t>
+      </w:r>
+      <w:r>
+        <w:t>. https://doi.org/10.1021/acs.est.1c02653</w:t>
       </w:r>
     </w:p>
     <w:p>
@@ -32274,19 +32246,19 @@
         <w:rPr>
           <w:b/>
         </w:rPr>
-        <w:t>[S-045]</w:t>
-      </w:r>
-      <w:r>
-        <w:t xml:space="preserve"> Jain, Presto &amp; Zimmerman (2021). </w:t>
+        <w:t>[S-046]</w:t>
+      </w:r>
+      <w:r>
+        <w:t xml:space="preserve"> Bashan, Li &amp; Wang (2024). </w:t>
       </w:r>
       <w:r>
         <w:rPr>
           <w:i/>
         </w:rPr>
-        <w:t>Spatial Modeling of Daily PM2.5, NO2, and CO Concentrations Measured by a Low-Cost Sensor Network</w:t>
-      </w:r>
-      <w:r>
-        <w:t>. https://doi.org/10.1021/acs.est.1c02653</w:t>
+        <w:t>Dynamics of PM2.5 and network activity during extreme pollution events</w:t>
+      </w:r>
+      <w:r>
+        <w:t>. https://doi.org/10.1038/s41612-024-00716-z</w:t>
       </w:r>
     </w:p>
     <w:p>
@@ -32297,19 +32269,19 @@
         <w:rPr>
           <w:b/>
         </w:rPr>
-        <w:t>[S-046]</w:t>
-      </w:r>
-      <w:r>
-        <w:t xml:space="preserve"> Bashan, Li &amp; Wang (2024). </w:t>
+        <w:t>[S-047]</w:t>
+      </w:r>
+      <w:r>
+        <w:t xml:space="preserve"> Perry et al. (2025). </w:t>
       </w:r>
       <w:r>
         <w:rPr>
           <w:i/>
         </w:rPr>
-        <w:t>Dynamics of PM2.5 and network activity during extreme pollution events</w:t>
-      </w:r>
-      <w:r>
-        <w:t>. https://doi.org/10.1038/s41612-024-00716-z</w:t>
+        <w:t>Detecting urban PM2.5 hotspots with mobile sensing and Gaussian process regression</w:t>
+      </w:r>
+      <w:r>
+        <w:t>. https://doi.org/10.1038/s44407-025-00038-1</w:t>
       </w:r>
     </w:p>
     <w:p>
@@ -32320,19 +32292,19 @@
         <w:rPr>
           <w:b/>
         </w:rPr>
-        <w:t>[S-047]</w:t>
-      </w:r>
-      <w:r>
-        <w:t xml:space="preserve"> Perry et al. (2025). </w:t>
+        <w:t>[S-048]</w:t>
+      </w:r>
+      <w:r>
+        <w:t xml:space="preserve"> Su, Chung, Lee &amp; Huang (2023). </w:t>
       </w:r>
       <w:r>
         <w:rPr>
           <w:i/>
         </w:rPr>
-        <w:t>Detecting urban PM2.5 hotspots with mobile sensing and Gaussian process regression</w:t>
-      </w:r>
-      <w:r>
-        <w:t>. https://doi.org/10.1038/s44407-025-00038-1</w:t>
+        <w:t>Effective PM2.5 concentration forecasting based on multiple spatial–temporal GNN for areas without monitoring stations</w:t>
+      </w:r>
+      <w:r>
+        <w:t>. https://doi.org/10.1016/j.eswa.2023.121074</w:t>
       </w:r>
     </w:p>
     <w:p>
@@ -32344,25 +32316,19 @@
           <w:b/>
         </w:rPr>
         <w:lastRenderedPageBreak/>
-        <w:t>[S-048]</w:t>
-      </w:r>
-      <w:r>
-        <w:t xml:space="preserve"> </w:t>
-      </w:r>
-      <w:r>
-        <w:t>🟡</w:t>
-      </w:r>
-      <w:r>
-        <w:t xml:space="preserve"> Su, Chung, Lee &amp; Huang (2023). </w:t>
+        <w:t>[S-049]</w:t>
+      </w:r>
+      <w:r>
+        <w:t xml:space="preserve"> Lu et al. (2025). </w:t>
       </w:r>
       <w:r>
         <w:rPr>
           <w:i/>
         </w:rPr>
-        <w:t>Effective PM2.5 concentration forecasting based on multiple spatial–temporal GNN for areas without monitoring stations</w:t>
-      </w:r>
-      <w:r>
-        <w:t>. https://doi.org/10.1016/j.eswa.2023.121074</w:t>
+        <w:t>Multi-scale dynamic graph neural network for PM2.5 concentration prediction in regional station cluster</w:t>
+      </w:r>
+      <w:r>
+        <w:t>. https://doi.org/10.1371/journal.pone.0338392</w:t>
       </w:r>
     </w:p>
     <w:p>
@@ -32373,19 +32339,19 @@
         <w:rPr>
           <w:b/>
         </w:rPr>
-        <w:t>[S-049]</w:t>
-      </w:r>
-      <w:r>
-        <w:t xml:space="preserve"> Lu et al. (2025). </w:t>
+        <w:t>[S-051]</w:t>
+      </w:r>
+      <w:r>
+        <w:t xml:space="preserve"> Chen, Putra &amp; Lin (2021). </w:t>
       </w:r>
       <w:r>
         <w:rPr>
           <w:i/>
         </w:rPr>
-        <w:t>Multi-scale dynamic graph neural network for PM2.5 concentration prediction in regional station cluster</w:t>
-      </w:r>
-      <w:r>
-        <w:t>. https://doi.org/10.1371/journal.pone.0338392</w:t>
+        <w:t>A Novel Prediction Approach for Exploring PM2.5 Spatiotemporal Propagation Based on Convolutional Recursive Neural Networks</w:t>
+      </w:r>
+      <w:r>
+        <w:t>. https://arxiv.org/abs/2101.06213</w:t>
       </w:r>
     </w:p>
     <w:p>
@@ -32396,19 +32362,19 @@
         <w:rPr>
           <w:b/>
         </w:rPr>
-        <w:t>[S-051]</w:t>
-      </w:r>
-      <w:r>
-        <w:t xml:space="preserve"> Chen, Putra &amp; Lin (2021). </w:t>
+        <w:t>[S-052]</w:t>
+      </w:r>
+      <w:r>
+        <w:t xml:space="preserve"> WHO (2024). </w:t>
       </w:r>
       <w:r>
         <w:rPr>
           <w:i/>
         </w:rPr>
-        <w:t>A Novel Prediction Approach for Exploring PM2.5 Spatiotemporal Propagation Based on Convolutional Recursive Neural Networks</w:t>
-      </w:r>
-      <w:r>
-        <w:t>. https://arxiv.org/abs/2101.06213</w:t>
+        <w:t>Ambient (outdoor) air pollution fact sheet</w:t>
+      </w:r>
+      <w:r>
+        <w:t>. https://www.who.int/news-room/fact-sheets/detail/ambient-(outdoor)-air-quality-and-health</w:t>
       </w:r>
     </w:p>
     <w:p>
@@ -32419,19 +32385,19 @@
         <w:rPr>
           <w:b/>
         </w:rPr>
-        <w:t>[S-052]</w:t>
-      </w:r>
-      <w:r>
-        <w:t xml:space="preserve"> WHO (2024). </w:t>
+        <w:t>[S-053]</w:t>
+      </w:r>
+      <w:r>
+        <w:t xml:space="preserve"> Ma, Ran, Song &amp; Gao (2026). </w:t>
       </w:r>
       <w:r>
         <w:rPr>
           <w:i/>
         </w:rPr>
-        <w:t>Ambient (outdoor) air pollution fact sheet</w:t>
-      </w:r>
-      <w:r>
-        <w:t>. https://www.who.int/news-room/fact-sheets/detail/ambient-(outdoor)-air-quality-and-health</w:t>
+        <w:t>Multi-agent AI for end-to-end air quality analysis and decision support</w:t>
+      </w:r>
+      <w:r>
+        <w:t>. https://doi.org/10.1038/s44407-026-00102-4</w:t>
       </w:r>
     </w:p>
     <w:p>
@@ -32442,19 +32408,19 @@
         <w:rPr>
           <w:b/>
         </w:rPr>
-        <w:t>[S-053]</w:t>
-      </w:r>
-      <w:r>
-        <w:t xml:space="preserve"> Ma, Ran, Song &amp; Gao (2026). </w:t>
+        <w:t>[S-054]</w:t>
+      </w:r>
+      <w:r>
+        <w:t xml:space="preserve"> Gao et al. (2025). </w:t>
       </w:r>
       <w:r>
         <w:rPr>
           <w:i/>
         </w:rPr>
-        <w:t>Multi-agent AI for end-to-end air quality analysis and decision support</w:t>
-      </w:r>
-      <w:r>
-        <w:t>. https://doi.org/10.1038/s44407-026-00102-4</w:t>
+        <w:t>Instructor-Worker Large Language Model System for Policy Recommendation: a Case Study on Air Quality Analysis of the January 2025 Los Angeles Wildfires</w:t>
+      </w:r>
+      <w:r>
+        <w:t>. https://arxiv.org/abs/2503.00566</w:t>
       </w:r>
     </w:p>
     <w:p>
@@ -32465,19 +32431,19 @@
         <w:rPr>
           <w:b/>
         </w:rPr>
-        <w:t>[S-054]</w:t>
-      </w:r>
-      <w:r>
-        <w:t xml:space="preserve"> Gao et al. (2025). </w:t>
+        <w:t>[S-055]</w:t>
+      </w:r>
+      <w:r>
+        <w:t xml:space="preserve"> Rahman et al. (2025). </w:t>
       </w:r>
       <w:r>
         <w:rPr>
           <w:i/>
         </w:rPr>
-        <w:t>Instructor-Worker Large Language Model System for Policy Recommendation: a Case Study on Air Quality Analysis of the January 2025 Los Angeles Wildfires</w:t>
-      </w:r>
-      <w:r>
-        <w:t>. https://arxiv.org/abs/2503.00566</w:t>
+        <w:t>LLM-Based Data Science Agents: A Survey of Capabilities, Challenges, and Future Directions</w:t>
+      </w:r>
+      <w:r>
+        <w:t>. https://arxiv.org/abs/2510.04023</w:t>
       </w:r>
     </w:p>
     <w:p>
@@ -32488,19 +32454,19 @@
         <w:rPr>
           <w:b/>
         </w:rPr>
-        <w:t>[S-055]</w:t>
-      </w:r>
-      <w:r>
-        <w:t xml:space="preserve"> Rahman et al. (2025). </w:t>
+        <w:t>[S-056]</w:t>
+      </w:r>
+      <w:r>
+        <w:t xml:space="preserve"> Xu et al. (2026). </w:t>
       </w:r>
       <w:r>
         <w:rPr>
           <w:i/>
         </w:rPr>
-        <w:t>LLM-Based Data Science Agents: A Survey of Capabilities, Challenges, and Future Directions</w:t>
-      </w:r>
-      <w:r>
-        <w:t>. https://arxiv.org/abs/2510.04023</w:t>
+        <w:t>The Evolution of Tool Use in LLM Agents: From Single-Tool Call to Multi-Tool Orchestration</w:t>
+      </w:r>
+      <w:r>
+        <w:t>. https://arxiv.org/abs/2603.22862</w:t>
       </w:r>
     </w:p>
     <w:p>
@@ -32511,19 +32477,19 @@
         <w:rPr>
           <w:b/>
         </w:rPr>
-        <w:t>[S-056]</w:t>
-      </w:r>
-      <w:r>
-        <w:t xml:space="preserve"> Xu et al. (2026). </w:t>
+        <w:t>[S-057]</w:t>
+      </w:r>
+      <w:r>
+        <w:t xml:space="preserve"> Frischmon et al. (2026). </w:t>
       </w:r>
       <w:r>
         <w:rPr>
           <w:i/>
         </w:rPr>
-        <w:t>The Evolution of Tool Use in LLM Agents: From Single-Tool Call to Multi-Tool Orchestration</w:t>
-      </w:r>
-      <w:r>
-        <w:t>. https://arxiv.org/abs/2603.22862</w:t>
+        <w:t>Spatial and temporal approaches for differentiating local source and background air quality impacts using low-cost sensor networks</w:t>
+      </w:r>
+      <w:r>
+        <w:t>. https://doi.org/10.5194/egusphere-2026-4589</w:t>
       </w:r>
     </w:p>
     <w:p>
@@ -32534,19 +32500,19 @@
         <w:rPr>
           <w:b/>
         </w:rPr>
-        <w:t>[S-057]</w:t>
-      </w:r>
-      <w:r>
-        <w:t xml:space="preserve"> Frischmon et al. (2026). </w:t>
+        <w:t>[S-058]</w:t>
+      </w:r>
+      <w:r>
+        <w:t xml:space="preserve"> Tzeng, Lai &amp; Huang (2023). </w:t>
       </w:r>
       <w:r>
         <w:rPr>
           <w:i/>
         </w:rPr>
-        <w:t>Spatial and temporal approaches for differentiating local source and background air quality impacts using low-cost sensor networks</w:t>
-      </w:r>
-      <w:r>
-        <w:t>. https://doi.org/10.5194/egusphere-2026-4589</w:t>
+        <w:t>Spatially Adaptive Calibrations of AirBox PM2.5 Data</w:t>
+      </w:r>
+      <w:r>
+        <w:t>. https://doi.org/10.1111/biom.13819</w:t>
       </w:r>
     </w:p>
     <w:p>
@@ -32557,19 +32523,19 @@
         <w:rPr>
           <w:b/>
         </w:rPr>
-        <w:t>[S-058]</w:t>
-      </w:r>
-      <w:r>
-        <w:t xml:space="preserve"> Tzeng, Lai &amp; Huang (2023). </w:t>
+        <w:t>[S-059]</w:t>
+      </w:r>
+      <w:r>
+        <w:t xml:space="preserve"> Aman et al. (2025). </w:t>
       </w:r>
       <w:r>
         <w:rPr>
           <w:i/>
         </w:rPr>
-        <w:t>Spatially Adaptive Calibrations of AirBox PM2.5 Data</w:t>
-      </w:r>
-      <w:r>
-        <w:t>. https://doi.org/10.1111/biom.13819</w:t>
+        <w:t>Machine learning-based quantification and separation of emissions and meteorological effects on PM2.5 in Greater Bangkok</w:t>
+      </w:r>
+      <w:r>
+        <w:t>. https://doi.org/10.1038/s41598-025-99094-6</w:t>
       </w:r>
     </w:p>
     <w:p>
@@ -32580,19 +32546,19 @@
         <w:rPr>
           <w:b/>
         </w:rPr>
-        <w:t>[S-059]</w:t>
-      </w:r>
-      <w:r>
-        <w:t xml:space="preserve"> Aman et al. (2025). </w:t>
+        <w:t>[S-060]</w:t>
+      </w:r>
+      <w:r>
+        <w:t xml:space="preserve"> Health Effects Institute (2025). </w:t>
       </w:r>
       <w:r>
         <w:rPr>
           <w:i/>
         </w:rPr>
-        <w:t>Machine learning-based quantification and separation of emissions and meteorological effects on PM2.5 in Greater Bangkok</w:t>
-      </w:r>
-      <w:r>
-        <w:t>. https://doi.org/10.1038/s41598-025-99094-6</w:t>
+        <w:t>State of Global Air 2025</w:t>
+      </w:r>
+      <w:r>
+        <w:t>. https://www.stateofglobalair.org/news-events/2025/new-state-global-air-2025-report-shows-nearly-nine-ten-global-air-pollution-deaths</w:t>
       </w:r>
     </w:p>
     <w:p>
@@ -32603,19 +32569,19 @@
         <w:rPr>
           <w:b/>
         </w:rPr>
-        <w:t>[S-060]</w:t>
-      </w:r>
-      <w:r>
-        <w:t xml:space="preserve"> Health Effects Institute (2025). </w:t>
+        <w:t>[S-061]</w:t>
+      </w:r>
+      <w:r>
+        <w:t xml:space="preserve"> Ku et al. (2025). </w:t>
       </w:r>
       <w:r>
         <w:rPr>
           <w:i/>
         </w:rPr>
-        <w:t>State of Global Air 2025</w:t>
-      </w:r>
-      <w:r>
-        <w:t>. https://www.stateofglobalair.org/news-events/2025/new-state-global-air-2025-report-shows-nearly-nine-ten-global-air-pollution-deaths</w:t>
+        <w:t>Does ambient PM2.5 reduce the protective association of leisure-time physical activity with mortality? A systematic review, meta-analysis, and individual-level pooled analysis of cohort studies involving 1.5 million adults</w:t>
+      </w:r>
+      <w:r>
+        <w:t>. https://doi.org/10.1186/s12916-025-04496-y</w:t>
       </w:r>
     </w:p>
     <w:p>
@@ -32626,19 +32592,19 @@
         <w:rPr>
           <w:b/>
         </w:rPr>
-        <w:t>[S-061]</w:t>
-      </w:r>
-      <w:r>
-        <w:t xml:space="preserve"> Ku et al. (2025). </w:t>
+        <w:t>[S-062]</w:t>
+      </w:r>
+      <w:r>
+        <w:t xml:space="preserve"> Cibin et al. (2025). </w:t>
       </w:r>
       <w:r>
         <w:rPr>
           <w:i/>
         </w:rPr>
-        <w:t>Does ambient PM2.5 reduce the protective association of leisure-time physical activity with mortality? A systematic review, meta-analysis, and individual-level pooled analysis of cohort studies involving 1.5 million adults</w:t>
-      </w:r>
-      <w:r>
-        <w:t>. https://doi.org/10.1186/s12916-025-04496-y</w:t>
+        <w:t>Promoting air quality-related awareness and behavioural change: A rapid review of communication interventions integrating behavioural, science communication and socio-ecological perspectives</w:t>
+      </w:r>
+      <w:r>
+        <w:t>. https://doi.org/10.1016/j.envc.2025.101237</w:t>
       </w:r>
     </w:p>
     <w:p>
@@ -32649,26 +32615,20 @@
         <w:rPr>
           <w:b/>
         </w:rPr>
-        <w:t>[S-062]</w:t>
-      </w:r>
-      <w:r>
-        <w:t xml:space="preserve"> Cibin et al. (2025). </w:t>
+        <w:lastRenderedPageBreak/>
+        <w:t>[S-063]</w:t>
+      </w:r>
+      <w:r>
+        <w:t xml:space="preserve"> Huang, Yuan, Yen, Tu &amp; Tseng (2024). </w:t>
       </w:r>
       <w:r>
         <w:rPr>
           <w:i/>
         </w:rPr>
-        <w:t xml:space="preserve">Promoting air quality-related awareness and behavioural change: A rapid review of communication interventions integrating behavioural, science </w:t>
-      </w:r>
-      <w:r>
-        <w:rPr>
-          <w:i/>
-        </w:rPr>
-        <w:lastRenderedPageBreak/>
-        <w:t>communication and socio-ecological perspectives</w:t>
-      </w:r>
-      <w:r>
-        <w:t>. https://doi.org/10.1016/j.envc.2025.101237</w:t>
+        <w:t>Temporal variations and chemical characteristics of marine PM2.5 at Dongsha Islands, South China Sea: Three-year measurement</w:t>
+      </w:r>
+      <w:r>
+        <w:t>. https://doi.org/10.1016/j.envpol.2024.124378</w:t>
       </w:r>
     </w:p>
     <w:p>
@@ -32945,31 +32905,31 @@
       </w:rPr>
     </w:lvl>
   </w:abstractNum>
-  <w:num w:numId="1" w16cid:durableId="121309233">
+  <w:num w:numId="1" w16cid:durableId="1467696201">
     <w:abstractNumId w:val="8"/>
   </w:num>
-  <w:num w:numId="2" w16cid:durableId="928925769">
+  <w:num w:numId="2" w16cid:durableId="1045369721">
     <w:abstractNumId w:val="6"/>
   </w:num>
-  <w:num w:numId="3" w16cid:durableId="843326738">
+  <w:num w:numId="3" w16cid:durableId="1534348162">
     <w:abstractNumId w:val="5"/>
   </w:num>
-  <w:num w:numId="4" w16cid:durableId="483396191">
+  <w:num w:numId="4" w16cid:durableId="1871723188">
     <w:abstractNumId w:val="4"/>
   </w:num>
-  <w:num w:numId="5" w16cid:durableId="1041708983">
+  <w:num w:numId="5" w16cid:durableId="1336880904">
     <w:abstractNumId w:val="7"/>
   </w:num>
-  <w:num w:numId="6" w16cid:durableId="546994257">
+  <w:num w:numId="6" w16cid:durableId="410735557">
     <w:abstractNumId w:val="3"/>
   </w:num>
-  <w:num w:numId="7" w16cid:durableId="448621889">
+  <w:num w:numId="7" w16cid:durableId="171452528">
     <w:abstractNumId w:val="2"/>
   </w:num>
-  <w:num w:numId="8" w16cid:durableId="1838033592">
+  <w:num w:numId="8" w16cid:durableId="135344394">
     <w:abstractNumId w:val="1"/>
   </w:num>
-  <w:num w:numId="9" w16cid:durableId="2102286963">
+  <w:num w:numId="9" w16cid:durableId="735126344">
     <w:abstractNumId w:val="0"/>
   </w:num>
 </w:numbering>
@@ -44359,7 +44319,7 @@
     <w:autoRedefine/>
     <w:uiPriority w:val="39"/>
     <w:unhideWhenUsed/>
-    <w:rsid w:val="003E4655"/>
+    <w:rsid w:val="00BB6B5C"/>
   </w:style>
   <w:style w:type="paragraph" w:styleId="2a">
     <w:name w:val="toc 2"/>
@@ -44368,7 +44328,7 @@
     <w:autoRedefine/>
     <w:uiPriority w:val="39"/>
     <w:unhideWhenUsed/>
-    <w:rsid w:val="003E4655"/>
+    <w:rsid w:val="00BB6B5C"/>
     <w:pPr>
       <w:ind w:leftChars="200" w:left="480"/>
     </w:pPr>
@@ -44378,7 +44338,7 @@
     <w:basedOn w:val="a2"/>
     <w:uiPriority w:val="99"/>
     <w:unhideWhenUsed/>
-    <w:rsid w:val="003E4655"/>
+    <w:rsid w:val="00BB6B5C"/>
     <w:rPr>
       <w:color w:val="0000FF" w:themeColor="hyperlink"/>
       <w:u w:val="single"/>

</xml_diff>